<commit_message>
Bỏ mẫu Biên bản kiểm tra nội bộ của nhà thầu, đánh số lại BM-06..BM-15
Co-Authored-By: Claude Opus 5.5 <noreply@anthropic.com>
Claude-Session: https://claude.ai/code/session_0158fUfqQUaKSG1u1ZmoQy8A
</commit_message>
<xml_diff>
--- a/bien-ban-nghiem-thu/Bo_mau_BBNT_ND207.docx
+++ b/bien-ban-nghiem-thu/Bo_mau_BBNT_ND207.docx
@@ -905,7 +905,7 @@
         <w:rPr>
           <w:rFonts w:ascii="Times New Roman" w:cs="Times New Roman" w:eastAsia="Times New Roman" w:hAnsi="Times New Roman"/>
         </w:rPr>
-        <w:t xml:space="preserve">3. Bổ sung các biểu mẫu còn thiếu: Biên bản kiểm tra sự phù hợp năng lực của nhà thầu; Biên bản bàn giao mặt bằng, tim mốc thi công; Biên bản lấy mẫu thí nghiệm; Biên bản kiểm tra nội bộ của nhà thầu; Biên bản bàn giao công trình đưa vào sử dụng.</w:t>
+        <w:t xml:space="preserve">3. Bổ sung các biểu mẫu còn thiếu: Biên bản kiểm tra sự phù hợp năng lực của nhà thầu; Biên bản bàn giao mặt bằng, tim mốc thi công; Biên bản lấy mẫu thí nghiệm; Biên bản bàn giao công trình đưa vào sử dụng.</w:t>
       </w:r>
     </w:p>
     <w:p>
@@ -918,7 +918,7 @@
         <w:rPr>
           <w:rFonts w:ascii="Times New Roman" w:cs="Times New Roman" w:eastAsia="Times New Roman" w:hAnsi="Times New Roman"/>
         </w:rPr>
-        <w:t xml:space="preserve">Bộ biểu mẫu gồm 16 mẫu (có Danh mục kèm theo). Liên danh kính đề nghị Chủ đầu tư, Tư vấn quản lý dự án và Tư vấn giám sát xem xét, chấp thuận để Nhà thầu áp dụng thống nhất cho Gói thầu số 06.</w:t>
+        <w:t xml:space="preserve">Bộ biểu mẫu gồm 15 mẫu (có Danh mục kèm theo). Liên danh kính đề nghị Chủ đầu tư, Tư vấn quản lý dự án và Tư vấn giám sát xem xét, chấp thuận để Nhà thầu áp dụng thống nhất cho Gói thầu số 06.</w:t>
       </w:r>
     </w:p>
     <w:p>
@@ -2345,7 +2345,7 @@
               <w:rPr>
                 <w:rFonts w:ascii="Times New Roman" w:cs="Times New Roman" w:eastAsia="Times New Roman" w:hAnsi="Times New Roman"/>
               </w:rPr>
-              <w:t xml:space="preserve">Biên bản kiểm tra nội bộ của nhà thầu</w:t>
+              <w:t xml:space="preserve">Biên bản nghiệm thu công việc xây dựng</w:t>
             </w:r>
           </w:p>
         </w:tc>
@@ -2369,7 +2369,7 @@
               <w:rPr>
                 <w:rFonts w:ascii="Times New Roman" w:cs="Times New Roman" w:eastAsia="Times New Roman" w:hAnsi="Times New Roman"/>
               </w:rPr>
-              <w:t xml:space="preserve">Trách nhiệm của nhà thầu thi công – NĐ 207/2026</w:t>
+              <w:t xml:space="preserve">Điều 22 NĐ 207/2026</w:t>
             </w:r>
           </w:p>
         </w:tc>
@@ -2393,7 +2393,7 @@
               <w:rPr>
                 <w:rFonts w:ascii="Times New Roman" w:cs="Times New Roman" w:eastAsia="Times New Roman" w:hAnsi="Times New Roman"/>
               </w:rPr>
-              <w:t xml:space="preserve">Bổ sung</w:t>
+              <w:t xml:space="preserve">Sửa (Mẫu 2 cũ)</w:t>
             </w:r>
           </w:p>
         </w:tc>
@@ -2467,7 +2467,7 @@
               <w:rPr>
                 <w:rFonts w:ascii="Times New Roman" w:cs="Times New Roman" w:eastAsia="Times New Roman" w:hAnsi="Times New Roman"/>
               </w:rPr>
-              <w:t xml:space="preserve">Biên bản nghiệm thu công việc xây dựng</w:t>
+              <w:t xml:space="preserve">Biên bản nghiệm thu giai đoạn thi công xây dựng / bộ phận công trình xây dựng</w:t>
             </w:r>
           </w:p>
         </w:tc>
@@ -2491,7 +2491,7 @@
               <w:rPr>
                 <w:rFonts w:ascii="Times New Roman" w:cs="Times New Roman" w:eastAsia="Times New Roman" w:hAnsi="Times New Roman"/>
               </w:rPr>
-              <w:t xml:space="preserve">Điều 22 NĐ 207/2026</w:t>
+              <w:t xml:space="preserve">Điều 23 NĐ 207/2026</w:t>
             </w:r>
           </w:p>
         </w:tc>
@@ -2515,7 +2515,7 @@
               <w:rPr>
                 <w:rFonts w:ascii="Times New Roman" w:cs="Times New Roman" w:eastAsia="Times New Roman" w:hAnsi="Times New Roman"/>
               </w:rPr>
-              <w:t xml:space="preserve">Sửa (Mẫu 2 cũ)</w:t>
+              <w:t xml:space="preserve">Sửa (Mẫu 3 cũ)</w:t>
             </w:r>
           </w:p>
         </w:tc>
@@ -2589,7 +2589,7 @@
               <w:rPr>
                 <w:rFonts w:ascii="Times New Roman" w:cs="Times New Roman" w:eastAsia="Times New Roman" w:hAnsi="Times New Roman"/>
               </w:rPr>
-              <w:t xml:space="preserve">Biên bản nghiệm thu giai đoạn thi công xây dựng / bộ phận công trình xây dựng</w:t>
+              <w:t xml:space="preserve">Biên bản nghiệm thu hoàn thành hạng mục công trình / công trình xây dựng đưa vào sử dụng</w:t>
             </w:r>
           </w:p>
         </w:tc>
@@ -2613,7 +2613,7 @@
               <w:rPr>
                 <w:rFonts w:ascii="Times New Roman" w:cs="Times New Roman" w:eastAsia="Times New Roman" w:hAnsi="Times New Roman"/>
               </w:rPr>
-              <w:t xml:space="preserve">Điều 23 NĐ 207/2026</w:t>
+              <w:t xml:space="preserve">Điều 24 NĐ 207/2026</w:t>
             </w:r>
           </w:p>
         </w:tc>
@@ -2637,7 +2637,7 @@
               <w:rPr>
                 <w:rFonts w:ascii="Times New Roman" w:cs="Times New Roman" w:eastAsia="Times New Roman" w:hAnsi="Times New Roman"/>
               </w:rPr>
-              <w:t xml:space="preserve">Sửa (Mẫu 3 cũ)</w:t>
+              <w:t xml:space="preserve">Sửa, gộp (Mẫu 3* và Mẫu 4 cũ)</w:t>
             </w:r>
           </w:p>
         </w:tc>
@@ -2711,7 +2711,7 @@
               <w:rPr>
                 <w:rFonts w:ascii="Times New Roman" w:cs="Times New Roman" w:eastAsia="Times New Roman" w:hAnsi="Times New Roman"/>
               </w:rPr>
-              <w:t xml:space="preserve">Biên bản nghiệm thu hoàn thành hạng mục công trình / công trình xây dựng đưa vào sử dụng</w:t>
+              <w:t xml:space="preserve">Biên bản bàn giao hạng mục công trình / công trình đưa vào sử dụng</w:t>
             </w:r>
           </w:p>
         </w:tc>
@@ -2735,7 +2735,7 @@
               <w:rPr>
                 <w:rFonts w:ascii="Times New Roman" w:cs="Times New Roman" w:eastAsia="Times New Roman" w:hAnsi="Times New Roman"/>
               </w:rPr>
-              <w:t xml:space="preserve">Điều 24 NĐ 207/2026</w:t>
+              <w:t xml:space="preserve">Luật Xây dựng; NĐ 207/2026</w:t>
             </w:r>
           </w:p>
         </w:tc>
@@ -2759,7 +2759,7 @@
               <w:rPr>
                 <w:rFonts w:ascii="Times New Roman" w:cs="Times New Roman" w:eastAsia="Times New Roman" w:hAnsi="Times New Roman"/>
               </w:rPr>
-              <w:t xml:space="preserve">Sửa, gộp (Mẫu 3* và Mẫu 4 cũ)</w:t>
+              <w:t xml:space="preserve">Bổ sung (tách phần bàn giao khỏi Mẫu 4 cũ)</w:t>
             </w:r>
           </w:p>
         </w:tc>
@@ -2833,7 +2833,7 @@
               <w:rPr>
                 <w:rFonts w:ascii="Times New Roman" w:cs="Times New Roman" w:eastAsia="Times New Roman" w:hAnsi="Times New Roman"/>
               </w:rPr>
-              <w:t xml:space="preserve">Biên bản bàn giao hạng mục công trình / công trình đưa vào sử dụng</w:t>
+              <w:t xml:space="preserve">Bảng xác nhận khối lượng hoàn thành theo hợp đồng (phục vụ thanh toán)</w:t>
             </w:r>
           </w:p>
         </w:tc>
@@ -2857,7 +2857,7 @@
               <w:rPr>
                 <w:rFonts w:ascii="Times New Roman" w:cs="Times New Roman" w:eastAsia="Times New Roman" w:hAnsi="Times New Roman"/>
               </w:rPr>
-              <w:t xml:space="preserve">Luật Xây dựng; NĐ 207/2026</w:t>
+              <w:t xml:space="preserve">Hợp đồng xây dựng</w:t>
             </w:r>
           </w:p>
         </w:tc>
@@ -2881,7 +2881,7 @@
               <w:rPr>
                 <w:rFonts w:ascii="Times New Roman" w:cs="Times New Roman" w:eastAsia="Times New Roman" w:hAnsi="Times New Roman"/>
               </w:rPr>
-              <w:t xml:space="preserve">Bổ sung (tách phần bàn giao khỏi Mẫu 4 cũ)</w:t>
+              <w:t xml:space="preserve">Thay thế Mẫu 5 cũ "Nghiệm thu thanh toán"</w:t>
             </w:r>
           </w:p>
         </w:tc>
@@ -2955,7 +2955,7 @@
               <w:rPr>
                 <w:rFonts w:ascii="Times New Roman" w:cs="Times New Roman" w:eastAsia="Times New Roman" w:hAnsi="Times New Roman"/>
               </w:rPr>
-              <w:t xml:space="preserve">Bảng xác nhận khối lượng hoàn thành theo hợp đồng (phục vụ thanh toán)</w:t>
+              <w:t xml:space="preserve">Biên bản kiểm tra, xử lý vi phạm chất lượng tại hiện trường</w:t>
             </w:r>
           </w:p>
         </w:tc>
@@ -2979,7 +2979,7 @@
               <w:rPr>
                 <w:rFonts w:ascii="Times New Roman" w:cs="Times New Roman" w:eastAsia="Times New Roman" w:hAnsi="Times New Roman"/>
               </w:rPr>
-              <w:t xml:space="preserve">Hợp đồng xây dựng</w:t>
+              <w:t xml:space="preserve">NĐ 207/2026</w:t>
             </w:r>
           </w:p>
         </w:tc>
@@ -3003,7 +3003,7 @@
               <w:rPr>
                 <w:rFonts w:ascii="Times New Roman" w:cs="Times New Roman" w:eastAsia="Times New Roman" w:hAnsi="Times New Roman"/>
               </w:rPr>
-              <w:t xml:space="preserve">Thay thế Mẫu 5 cũ "Nghiệm thu thanh toán"</w:t>
+              <w:t xml:space="preserve">Sửa (Mẫu 7 cũ)</w:t>
             </w:r>
           </w:p>
         </w:tc>
@@ -3077,7 +3077,7 @@
               <w:rPr>
                 <w:rFonts w:ascii="Times New Roman" w:cs="Times New Roman" w:eastAsia="Times New Roman" w:hAnsi="Times New Roman"/>
               </w:rPr>
-              <w:t xml:space="preserve">Biên bản kiểm tra, xử lý vi phạm chất lượng tại hiện trường</w:t>
+              <w:t xml:space="preserve">Biên bản xử lý kỹ thuật tại hiện trường</w:t>
             </w:r>
           </w:p>
         </w:tc>
@@ -3125,7 +3125,7 @@
               <w:rPr>
                 <w:rFonts w:ascii="Times New Roman" w:cs="Times New Roman" w:eastAsia="Times New Roman" w:hAnsi="Times New Roman"/>
               </w:rPr>
-              <w:t xml:space="preserve">Sửa (Mẫu 7 cũ)</w:t>
+              <w:t xml:space="preserve">Sửa (Mẫu 8 cũ)</w:t>
             </w:r>
           </w:p>
         </w:tc>
@@ -3199,7 +3199,7 @@
               <w:rPr>
                 <w:rFonts w:ascii="Times New Roman" w:cs="Times New Roman" w:eastAsia="Times New Roman" w:hAnsi="Times New Roman"/>
               </w:rPr>
-              <w:t xml:space="preserve">Biên bản xử lý kỹ thuật tại hiện trường</w:t>
+              <w:t xml:space="preserve">Nhật ký thi công xây dựng công trình</w:t>
             </w:r>
           </w:p>
         </w:tc>
@@ -3223,7 +3223,7 @@
               <w:rPr>
                 <w:rFonts w:ascii="Times New Roman" w:cs="Times New Roman" w:eastAsia="Times New Roman" w:hAnsi="Times New Roman"/>
               </w:rPr>
-              <w:t xml:space="preserve">NĐ 207/2026</w:t>
+              <w:t xml:space="preserve">Khoản 13 Điều 15, Phụ lục IIa NĐ 207/2026</w:t>
             </w:r>
           </w:p>
         </w:tc>
@@ -3247,7 +3247,7 @@
               <w:rPr>
                 <w:rFonts w:ascii="Times New Roman" w:cs="Times New Roman" w:eastAsia="Times New Roman" w:hAnsi="Times New Roman"/>
               </w:rPr>
-              <w:t xml:space="preserve">Sửa (Mẫu 8 cũ)</w:t>
+              <w:t xml:space="preserve">Sửa</w:t>
             </w:r>
           </w:p>
         </w:tc>
@@ -3321,7 +3321,7 @@
               <w:rPr>
                 <w:rFonts w:ascii="Times New Roman" w:cs="Times New Roman" w:eastAsia="Times New Roman" w:hAnsi="Times New Roman"/>
               </w:rPr>
-              <w:t xml:space="preserve">Nhật ký thi công xây dựng công trình</w:t>
+              <w:t xml:space="preserve">Bản vẽ hoàn công – mẫu dấu bản vẽ hoàn công</w:t>
             </w:r>
           </w:p>
         </w:tc>
@@ -3345,7 +3345,7 @@
               <w:rPr>
                 <w:rFonts w:ascii="Times New Roman" w:cs="Times New Roman" w:eastAsia="Times New Roman" w:hAnsi="Times New Roman"/>
               </w:rPr>
-              <w:t xml:space="preserve">Khoản 13 Điều 15, Phụ lục IIa NĐ 207/2026</w:t>
+              <w:t xml:space="preserve">Phụ lục IIb NĐ 207/2026</w:t>
             </w:r>
           </w:p>
         </w:tc>
@@ -3443,128 +3443,6 @@
               <w:rPr>
                 <w:rFonts w:ascii="Times New Roman" w:cs="Times New Roman" w:eastAsia="Times New Roman" w:hAnsi="Times New Roman"/>
               </w:rPr>
-              <w:t xml:space="preserve">Bản vẽ hoàn công – mẫu dấu bản vẽ hoàn công</w:t>
-            </w:r>
-          </w:p>
-        </w:tc>
-        <w:tc>
-          <w:tcPr>
-            <w:tcW w:type="dxa" w:w="2123"/>
-            <w:tcMar>
-              <w:top w:type="dxa" w:w="40"/>
-              <w:left w:type="dxa" w:w="80"/>
-              <w:bottom w:type="dxa" w:w="40"/>
-              <w:right w:type="dxa" w:w="80"/>
-            </w:tcMar>
-            <w:vAlign w:val="center"/>
-          </w:tcPr>
-          <w:p>
-            <w:pPr>
-              <w:spacing w:after="20" w:before="20" w:line="276"/>
-              <w:jc w:val="left"/>
-            </w:pPr>
-            <w:r>
-              <w:rPr>
-                <w:rFonts w:ascii="Times New Roman" w:cs="Times New Roman" w:eastAsia="Times New Roman" w:hAnsi="Times New Roman"/>
-              </w:rPr>
-              <w:t xml:space="preserve">Phụ lục IIb NĐ 207/2026</w:t>
-            </w:r>
-          </w:p>
-        </w:tc>
-        <w:tc>
-          <w:tcPr>
-            <w:tcW w:type="dxa" w:w="1931"/>
-            <w:tcMar>
-              <w:top w:type="dxa" w:w="40"/>
-              <w:left w:type="dxa" w:w="80"/>
-              <w:bottom w:type="dxa" w:w="40"/>
-              <w:right w:type="dxa" w:w="80"/>
-            </w:tcMar>
-            <w:vAlign w:val="center"/>
-          </w:tcPr>
-          <w:p>
-            <w:pPr>
-              <w:spacing w:after="20" w:before="20" w:line="276"/>
-              <w:jc w:val="left"/>
-            </w:pPr>
-            <w:r>
-              <w:rPr>
-                <w:rFonts w:ascii="Times New Roman" w:cs="Times New Roman" w:eastAsia="Times New Roman" w:hAnsi="Times New Roman"/>
-              </w:rPr>
-              <w:t xml:space="preserve">Sửa</w:t>
-            </w:r>
-          </w:p>
-        </w:tc>
-      </w:tr>
-      <w:tr>
-        <w:tc>
-          <w:tcPr>
-            <w:tcW w:type="dxa" w:w="579"/>
-            <w:tcMar>
-              <w:top w:type="dxa" w:w="40"/>
-              <w:left w:type="dxa" w:w="80"/>
-              <w:bottom w:type="dxa" w:w="40"/>
-              <w:right w:type="dxa" w:w="80"/>
-            </w:tcMar>
-            <w:vAlign w:val="center"/>
-          </w:tcPr>
-          <w:p>
-            <w:pPr>
-              <w:spacing w:after="20" w:before="20" w:line="276"/>
-              <w:jc w:val="center"/>
-            </w:pPr>
-            <w:r>
-              <w:rPr>
-                <w:rFonts w:ascii="Times New Roman" w:cs="Times New Roman" w:eastAsia="Times New Roman" w:hAnsi="Times New Roman"/>
-              </w:rPr>
-              <w:t xml:space="preserve">16</w:t>
-            </w:r>
-          </w:p>
-        </w:tc>
-        <w:tc>
-          <w:tcPr>
-            <w:tcW w:type="dxa" w:w="965"/>
-            <w:tcMar>
-              <w:top w:type="dxa" w:w="40"/>
-              <w:left w:type="dxa" w:w="80"/>
-              <w:bottom w:type="dxa" w:w="40"/>
-              <w:right w:type="dxa" w:w="80"/>
-            </w:tcMar>
-            <w:vAlign w:val="center"/>
-          </w:tcPr>
-          <w:p>
-            <w:pPr>
-              <w:spacing w:after="20" w:before="20" w:line="276"/>
-              <w:jc w:val="left"/>
-            </w:pPr>
-            <w:r>
-              <w:rPr>
-                <w:rFonts w:ascii="Times New Roman" w:cs="Times New Roman" w:eastAsia="Times New Roman" w:hAnsi="Times New Roman"/>
-              </w:rPr>
-              <w:t xml:space="preserve">BM-16</w:t>
-            </w:r>
-          </w:p>
-        </w:tc>
-        <w:tc>
-          <w:tcPr>
-            <w:tcW w:type="dxa" w:w="3474"/>
-            <w:tcMar>
-              <w:top w:type="dxa" w:w="40"/>
-              <w:left w:type="dxa" w:w="80"/>
-              <w:bottom w:type="dxa" w:w="40"/>
-              <w:right w:type="dxa" w:w="80"/>
-            </w:tcMar>
-            <w:vAlign w:val="center"/>
-          </w:tcPr>
-          <w:p>
-            <w:pPr>
-              <w:spacing w:after="20" w:before="20" w:line="276"/>
-              <w:jc w:val="left"/>
-            </w:pPr>
-            <w:r>
-              <w:rPr>
-                <w:rFonts w:ascii="Times New Roman" w:cs="Times New Roman" w:eastAsia="Times New Roman" w:hAnsi="Times New Roman"/>
-              </w:rPr>
               <w:t xml:space="preserve">Danh mục hồ sơ hoàn thành công trình</w:t>
             </w:r>
           </w:p>
@@ -3643,43 +3521,43 @@
         <w:rPr>
           <w:rFonts w:ascii="Times New Roman" w:cs="Times New Roman" w:eastAsia="Times New Roman" w:hAnsi="Times New Roman"/>
         </w:rPr>
-        <w:t xml:space="preserve">- Mẫu 5 "Biên bản nghiệm thu thanh toán khối lượng xây lắp hoàn thành": Nghị định số 207/2026/NĐ-CP không quy định loại nghiệm thu này. Việc xác định khối lượng thanh toán thực hiện theo hợp đồng và quy định về hợp đồng xây dựng, nên thay bằng Bảng xác nhận khối lượng hoàn thành (BM-11).</w:t>
-      </w:r>
-    </w:p>
-    <w:p>
-      <w:pPr>
-        <w:spacing w:after="40" w:before="40" w:line="276"/>
-        <w:jc w:val="both"/>
-      </w:pPr>
-      <w:r>
-        <w:rPr>
-          <w:rFonts w:ascii="Times New Roman" w:cs="Times New Roman" w:eastAsia="Times New Roman" w:hAnsi="Times New Roman"/>
-        </w:rPr>
-        <w:t xml:space="preserve">- Mẫu 6 "Phiếu yêu cầu nghiệm thu, nhật ký thi công": chỉ có tiêu đề, không có nội dung. Đã thay bằng BM-01 và BM-14.</w:t>
-      </w:r>
-    </w:p>
-    <w:p>
-      <w:pPr>
-        <w:spacing w:after="40" w:before="40" w:line="276"/>
-        <w:jc w:val="both"/>
-      </w:pPr>
-      <w:r>
-        <w:rPr>
-          <w:rFonts w:ascii="Times New Roman" w:cs="Times New Roman" w:eastAsia="Times New Roman" w:hAnsi="Times New Roman"/>
-        </w:rPr>
-        <w:t xml:space="preserve">- Mẫu 7 "Hồ sơ hoàn công công trình" bị trùng số hiệu với Mẫu 7 "Xử lý vi phạm": đánh số lại thành BM-15 và BM-16.</w:t>
-      </w:r>
-    </w:p>
-    <w:p>
-      <w:pPr>
-        <w:spacing w:after="40" w:before="40" w:line="276"/>
-        <w:jc w:val="both"/>
-      </w:pPr>
-      <w:r>
-        <w:rPr>
-          <w:rFonts w:ascii="Times New Roman" w:cs="Times New Roman" w:eastAsia="Times New Roman" w:hAnsi="Times New Roman"/>
-        </w:rPr>
-        <w:t xml:space="preserve">- Mẫu 3* "Nghiệm thu hoàn thành công trình" trùng nội dung với Mẫu 4 và có ghi chú dành cho hợp đồng BOT, BTL: gộp vào BM-09.</w:t>
+        <w:t xml:space="preserve">- Mẫu 5 "Biên bản nghiệm thu thanh toán khối lượng xây lắp hoàn thành": Nghị định số 207/2026/NĐ-CP không quy định loại nghiệm thu này. Việc xác định khối lượng thanh toán thực hiện theo hợp đồng và quy định về hợp đồng xây dựng, nên thay bằng Bảng xác nhận khối lượng hoàn thành (BM-10).</w:t>
+      </w:r>
+    </w:p>
+    <w:p>
+      <w:pPr>
+        <w:spacing w:after="40" w:before="40" w:line="276"/>
+        <w:jc w:val="both"/>
+      </w:pPr>
+      <w:r>
+        <w:rPr>
+          <w:rFonts w:ascii="Times New Roman" w:cs="Times New Roman" w:eastAsia="Times New Roman" w:hAnsi="Times New Roman"/>
+        </w:rPr>
+        <w:t xml:space="preserve">- Mẫu 6 "Phiếu yêu cầu nghiệm thu, nhật ký thi công": chỉ có tiêu đề, không có nội dung. Đã thay bằng BM-01 và BM-13.</w:t>
+      </w:r>
+    </w:p>
+    <w:p>
+      <w:pPr>
+        <w:spacing w:after="40" w:before="40" w:line="276"/>
+        <w:jc w:val="both"/>
+      </w:pPr>
+      <w:r>
+        <w:rPr>
+          <w:rFonts w:ascii="Times New Roman" w:cs="Times New Roman" w:eastAsia="Times New Roman" w:hAnsi="Times New Roman"/>
+        </w:rPr>
+        <w:t xml:space="preserve">- Mẫu 7 "Hồ sơ hoàn công công trình" bị trùng số hiệu với Mẫu 7 "Xử lý vi phạm": đánh số lại thành BM-14 và BM-15.</w:t>
+      </w:r>
+    </w:p>
+    <w:p>
+      <w:pPr>
+        <w:spacing w:after="40" w:before="40" w:line="276"/>
+        <w:jc w:val="both"/>
+      </w:pPr>
+      <w:r>
+        <w:rPr>
+          <w:rFonts w:ascii="Times New Roman" w:cs="Times New Roman" w:eastAsia="Times New Roman" w:hAnsi="Times New Roman"/>
+        </w:rPr>
+        <w:t xml:space="preserve">- Mẫu 3* "Nghiệm thu hoàn thành công trình" trùng nội dung với Mẫu 4 và có ghi chú dành cho hợp đồng BOT, BTL: gộp vào BM-08.</w:t>
       </w:r>
     </w:p>
     <w:p>
@@ -4066,7 +3944,7 @@
         <w:rPr>
           <w:rFonts w:ascii="Times New Roman" w:cs="Times New Roman" w:eastAsia="Times New Roman" w:hAnsi="Times New Roman"/>
         </w:rPr>
-        <w:t xml:space="preserve">Căn cứ Điều 22 (Điều 23, Điều 24) Nghị định số 207/2026/NĐ-CP ngày 15/6/2026 của Chính phủ; căn cứ kết quả kiểm tra nội bộ số ....... ngày ......., Nhà thầu đã hoàn thành và tự kiểm tra đạt yêu cầu các công việc dưới đây. Đề nghị Tư vấn giám sát (Tư vấn quản lý dự án) kiểm tra hiện trường và tổ chức nghiệm thu:</w:t>
+        <w:t xml:space="preserve">Căn cứ Điều 22 (Điều 23, Điều 24) Nghị định số 207/2026/NĐ-CP ngày 15/6/2026 của Chính phủ; căn cứ kết quả tự kiểm tra của Nhà thầu, Nhà thầu đã hoàn thành và tự kiểm tra đạt yêu cầu các công việc dưới đây. Đề nghị Tư vấn giám sát (Tư vấn quản lý dự án) kiểm tra hiện trường và tổ chức nghiệm thu:</w:t>
       </w:r>
     </w:p>
     <w:p>
@@ -4647,7 +4525,7 @@
           <w:i/>
           <w:iCs/>
         </w:rPr>
-        <w:t xml:space="preserve">(biên bản kiểm tra nội bộ, kết quả thí nghiệm, bản vẽ hoàn công, phiếu đo đạc...)</w:t>
+        <w:t xml:space="preserve">(kết quả thí nghiệm, bản vẽ hoàn công, phiếu đo đạc...)</w:t>
       </w:r>
     </w:p>
     <w:tbl>
@@ -9062,7 +8940,7 @@
         <w:rPr>
           <w:rFonts w:ascii="Times New Roman" w:cs="Times New Roman" w:eastAsia="Times New Roman" w:hAnsi="Times New Roman"/>
         </w:rPr>
-        <w:t xml:space="preserve">- Mọi sai lệch về mốc, mặt bằng so với hồ sơ thiết kế phải được các bên lập biên bản xử lý kỹ thuật hiện trường (BM-13).</w:t>
+        <w:t xml:space="preserve">- Mọi sai lệch về mốc, mặt bằng so với hồ sơ thiết kế phải được các bên lập biên bản xử lý kỹ thuật hiện trường (BM-12).</w:t>
       </w:r>
     </w:p>
     <w:tbl>
@@ -14032,151 +13910,52 @@
           <w:i/>
           <w:iCs/>
         </w:rPr>
-        <w:t xml:space="preserve">BM-06 – Kiểm tra nội bộ nhà thầu</w:t>
-      </w:r>
-    </w:p>
-    <w:tbl>
-      <w:tblPr>
-        <w:tblW w:type="dxa" w:w="9072"/>
-        <w:tblBorders>
-          <w:top w:val="none" w:color="FFFFFF" w:sz="0"/>
-          <w:left w:val="none" w:color="FFFFFF" w:sz="0"/>
-          <w:bottom w:val="none" w:color="FFFFFF" w:sz="0"/>
-          <w:right w:val="none" w:color="FFFFFF" w:sz="0"/>
-          <w:insideH w:val="none" w:color="FFFFFF" w:sz="0"/>
-          <w:insideV w:val="none" w:color="FFFFFF" w:sz="0"/>
-        </w:tblBorders>
-      </w:tblPr>
-      <w:tblGrid>
-        <w:gridCol w:w="4300"/>
-        <w:gridCol w:w="4772"/>
-      </w:tblGrid>
-      <w:tr>
-        <w:tc>
-          <w:tcPr>
-            <w:tcW w:type="dxa" w:w="4300"/>
-            <w:tcMar>
-              <w:top w:type="dxa" w:w="40"/>
-              <w:left w:type="dxa" w:w="80"/>
-              <w:bottom w:type="dxa" w:w="40"/>
-              <w:right w:type="dxa" w:w="80"/>
-            </w:tcMar>
-            <w:vAlign w:val="top"/>
-          </w:tcPr>
-          <w:p>
-            <w:pPr>
-              <w:spacing w:after="0" w:before="0" w:line="276"/>
-              <w:jc w:val="center"/>
-            </w:pPr>
-            <w:r>
-              <w:rPr>
-                <w:rFonts w:ascii="Times New Roman" w:cs="Times New Roman" w:eastAsia="Times New Roman" w:hAnsi="Times New Roman"/>
-                <w:b/>
-                <w:bCs/>
-              </w:rPr>
-              <w:t xml:space="preserve">LIÊN DANH CÔNG TY TNHH HOÀNG TUẤN -</w:t>
-            </w:r>
-          </w:p>
-          <w:p>
-            <w:pPr>
-              <w:spacing w:after="0" w:before="0" w:line="276"/>
-              <w:jc w:val="center"/>
-            </w:pPr>
-            <w:r>
-              <w:rPr>
-                <w:rFonts w:ascii="Times New Roman" w:cs="Times New Roman" w:eastAsia="Times New Roman" w:hAnsi="Times New Roman"/>
-                <w:b/>
-                <w:bCs/>
-              </w:rPr>
-              <w:t xml:space="preserve">CÔNG TY CP ĐT&amp;XD TUẤN LINH</w:t>
-            </w:r>
-          </w:p>
-          <w:p>
-            <w:pPr>
-              <w:spacing w:after="0" w:before="0" w:line="276"/>
-              <w:jc w:val="center"/>
-            </w:pPr>
-            <w:r>
-              <w:rPr>
-                <w:rFonts w:ascii="Times New Roman" w:cs="Times New Roman" w:eastAsia="Times New Roman" w:hAnsi="Times New Roman"/>
-                <w:sz w:val="22"/>
-                <w:szCs w:val="22"/>
-              </w:rPr>
-              <w:t xml:space="preserve">BAN CHỈ HUY CÔNG TRƯỜNG</w:t>
-            </w:r>
-          </w:p>
-          <w:p>
-            <w:pPr>
-              <w:spacing w:after="0" w:before="0" w:line="276"/>
-              <w:jc w:val="center"/>
-            </w:pPr>
-            <w:r>
-              <w:rPr>
-                <w:rFonts w:ascii="Times New Roman" w:cs="Times New Roman" w:eastAsia="Times New Roman" w:hAnsi="Times New Roman"/>
-                <w:sz w:val="22"/>
-                <w:szCs w:val="22"/>
-              </w:rPr>
-              <w:t xml:space="preserve">Số: ....../BBNB-HT-TL</w:t>
-            </w:r>
-          </w:p>
-        </w:tc>
-        <w:tc>
-          <w:tcPr>
-            <w:tcW w:type="dxa" w:w="4772"/>
-            <w:tcMar>
-              <w:top w:type="dxa" w:w="40"/>
-              <w:left w:type="dxa" w:w="80"/>
-              <w:bottom w:type="dxa" w:w="40"/>
-              <w:right w:type="dxa" w:w="80"/>
-            </w:tcMar>
-            <w:vAlign w:val="top"/>
-          </w:tcPr>
-          <w:p>
-            <w:pPr>
-              <w:spacing w:after="0" w:before="0" w:line="276"/>
-              <w:jc w:val="center"/>
-            </w:pPr>
-            <w:r>
-              <w:rPr>
-                <w:rFonts w:ascii="Times New Roman" w:cs="Times New Roman" w:eastAsia="Times New Roman" w:hAnsi="Times New Roman"/>
-                <w:b/>
-                <w:bCs/>
-              </w:rPr>
-              <w:t xml:space="preserve">CỘNG HÒA XÃ HỘI CHỦ NGHĨA VIỆT NAM</w:t>
-            </w:r>
-          </w:p>
-          <w:p>
-            <w:pPr>
-              <w:spacing w:after="60" w:before="0" w:line="276"/>
-              <w:jc w:val="center"/>
-            </w:pPr>
-            <w:r>
-              <w:rPr>
-                <w:rFonts w:ascii="Times New Roman" w:cs="Times New Roman" w:eastAsia="Times New Roman" w:hAnsi="Times New Roman"/>
-                <w:b/>
-                <w:bCs/>
-                <w:u w:val="single"/>
-              </w:rPr>
-              <w:t xml:space="preserve">Độc lập - Tự do - Hạnh phúc</w:t>
-            </w:r>
-          </w:p>
-          <w:p>
-            <w:pPr>
-              <w:spacing w:after="0" w:before="60" w:line="276"/>
-              <w:jc w:val="center"/>
-            </w:pPr>
-            <w:r>
-              <w:rPr>
-                <w:rFonts w:ascii="Times New Roman" w:cs="Times New Roman" w:eastAsia="Times New Roman" w:hAnsi="Times New Roman"/>
-                <w:i/>
-                <w:iCs/>
-              </w:rPr>
-              <w:t xml:space="preserve">Hoằng Tiến, ngày ..... tháng ..... năm 2026</w:t>
-            </w:r>
-          </w:p>
-        </w:tc>
-      </w:tr>
-    </w:tbl>
+        <w:t xml:space="preserve">BM-06 – Nghiệm thu công việc xây dựng</w:t>
+      </w:r>
+    </w:p>
+    <w:p>
+      <w:pPr>
+        <w:spacing w:after="0" w:before="0" w:line="276"/>
+        <w:jc w:val="center"/>
+      </w:pPr>
+      <w:r>
+        <w:rPr>
+          <w:rFonts w:ascii="Times New Roman" w:cs="Times New Roman" w:eastAsia="Times New Roman" w:hAnsi="Times New Roman"/>
+          <w:b/>
+          <w:bCs/>
+        </w:rPr>
+        <w:t xml:space="preserve">CỘNG HÒA XÃ HỘI CHỦ NGHĨA VIỆT NAM</w:t>
+      </w:r>
+    </w:p>
+    <w:p>
+      <w:pPr>
+        <w:spacing w:after="120" w:before="0" w:line="276"/>
+        <w:jc w:val="center"/>
+      </w:pPr>
+      <w:r>
+        <w:rPr>
+          <w:rFonts w:ascii="Times New Roman" w:cs="Times New Roman" w:eastAsia="Times New Roman" w:hAnsi="Times New Roman"/>
+          <w:b/>
+          <w:bCs/>
+          <w:u w:val="single"/>
+        </w:rPr>
+        <w:t xml:space="preserve">Độc lập - Tự do - Hạnh phúc</w:t>
+      </w:r>
+    </w:p>
+    <w:p>
+      <w:pPr>
+        <w:spacing w:after="120" w:before="0" w:line="276"/>
+        <w:jc w:val="right"/>
+      </w:pPr>
+      <w:r>
+        <w:rPr>
+          <w:rFonts w:ascii="Times New Roman" w:cs="Times New Roman" w:eastAsia="Times New Roman" w:hAnsi="Times New Roman"/>
+          <w:i/>
+          <w:iCs/>
+        </w:rPr>
+        <w:t xml:space="preserve">Hoằng Tiến, ngày ..... tháng ..... năm 2026</w:t>
+      </w:r>
+    </w:p>
     <w:p>
       <w:pPr>
         <w:spacing w:after="0" w:before="120" w:line="276"/>
@@ -14188,7 +13967,7 @@
           <w:b/>
           <w:bCs/>
         </w:rPr>
-        <w:t xml:space="preserve">BIÊN BẢN KIỂM TRA NỘI BỘ CỦA NHÀ THẦU</w:t>
+        <w:t xml:space="preserve">Số: ......../BBNT-CV</w:t>
       </w:r>
     </w:p>
     <w:p>
@@ -14202,7 +13981,7 @@
           <w:b/>
           <w:bCs/>
         </w:rPr>
-        <w:t xml:space="preserve">(trước khi đề nghị chủ đầu tư nghiệm thu)</w:t>
+        <w:t xml:space="preserve">BIÊN BẢN NGHIỆM THU CÔNG VIỆC XÂY DỰNG</w:t>
       </w:r>
     </w:p>
     <w:p>
@@ -14255,6 +14034,77 @@
           <w:rFonts w:ascii="Times New Roman" w:cs="Times New Roman" w:eastAsia="Times New Roman" w:hAnsi="Times New Roman"/>
         </w:rPr>
         <w:t xml:space="preserve">số 06 – Thi công xây dựng (bao gồm bảo hiểm công trình, đảm bảo an toàn giao thông).</w:t>
+      </w:r>
+    </w:p>
+    <w:p>
+      <w:pPr>
+        <w:spacing w:after="40" w:before="40" w:line="276"/>
+        <w:jc w:val="both"/>
+      </w:pPr>
+      <w:r>
+        <w:rPr>
+          <w:rFonts w:ascii="Times New Roman" w:cs="Times New Roman" w:eastAsia="Times New Roman" w:hAnsi="Times New Roman"/>
+          <w:b/>
+          <w:bCs/>
+        </w:rPr>
+        <w:t xml:space="preserve">Hạng mục: </w:t>
+      </w:r>
+      <w:r>
+        <w:rPr>
+          <w:rFonts w:ascii="Times New Roman" w:cs="Times New Roman" w:eastAsia="Times New Roman" w:hAnsi="Times New Roman"/>
+          <w:i/>
+          <w:iCs/>
+        </w:rPr>
+        <w:t xml:space="preserve">(ví dụ: Cống hộp đúc sẵn BxH = 2x(1,5x1,5)m ngang kênh tại Km3+500)</w:t>
+      </w:r>
+    </w:p>
+    <w:p>
+      <w:pPr>
+        <w:spacing w:after="40" w:before="40" w:line="276"/>
+        <w:jc w:val="both"/>
+      </w:pPr>
+      <w:r>
+        <w:rPr>
+          <w:rFonts w:ascii="Times New Roman" w:cs="Times New Roman" w:eastAsia="Times New Roman" w:hAnsi="Times New Roman"/>
+          <w:b/>
+          <w:bCs/>
+        </w:rPr>
+        <w:t xml:space="preserve">Địa điểm xây dựng: </w:t>
+      </w:r>
+      <w:r>
+        <w:rPr>
+          <w:rFonts w:ascii="Times New Roman" w:cs="Times New Roman" w:eastAsia="Times New Roman" w:hAnsi="Times New Roman"/>
+        </w:rPr>
+        <w:t xml:space="preserve">Xã Hoằng Tiến, tỉnh Thanh Hóa.</w:t>
+      </w:r>
+    </w:p>
+    <w:p>
+      <w:pPr>
+        <w:keepNext/>
+        <w:spacing w:after="40" w:before="100" w:line="276"/>
+        <w:jc w:val="both"/>
+      </w:pPr>
+      <w:r>
+        <w:rPr>
+          <w:rFonts w:ascii="Times New Roman" w:cs="Times New Roman" w:eastAsia="Times New Roman" w:hAnsi="Times New Roman"/>
+          <w:b/>
+          <w:bCs/>
+        </w:rPr>
+        <w:t xml:space="preserve">1. Tên công việc được nghiệm thu: </w:t>
+      </w:r>
+    </w:p>
+    <w:p>
+      <w:pPr>
+        <w:spacing w:after="40" w:before="40" w:line="276"/>
+        <w:jc w:val="both"/>
+      </w:pPr>
+      <w:r>
+        <w:rPr>
+          <w:rFonts w:ascii="Times New Roman" w:cs="Times New Roman" w:eastAsia="Times New Roman" w:hAnsi="Times New Roman"/>
+          <w:i/>
+          <w:iCs/>
+        </w:rPr>
+        <w:t xml:space="preserve">(ghi rõ tên công việc, vị trí, lý trình; có thể lập chung cho nhiều công việc của một hạng mục theo trình tự thi công)</w:t>
       </w:r>
     </w:p>
     <w:p>
@@ -14268,7 +14118,7 @@
         <w:rPr>
           <w:rFonts w:ascii="Times New Roman" w:cs="Times New Roman" w:eastAsia="Times New Roman" w:hAnsi="Times New Roman"/>
         </w:rPr>
-        <w:t xml:space="preserve">Hạng mục: </w:t>
+        <w:t xml:space="preserve"/>
       </w:r>
       <w:r>
         <w:rPr>
@@ -14279,7 +14129,8 @@
     </w:p>
     <w:p>
       <w:pPr>
-        <w:spacing w:after="40" w:before="40" w:line="276"/>
+        <w:keepNext/>
+        <w:spacing w:after="40" w:before="100" w:line="276"/>
         <w:jc w:val="both"/>
       </w:pPr>
       <w:r>
@@ -14288,19 +14139,13 @@
           <w:b/>
           <w:bCs/>
         </w:rPr>
-        <w:t xml:space="preserve">Địa điểm xây dựng: </w:t>
-      </w:r>
-      <w:r>
-        <w:rPr>
-          <w:rFonts w:ascii="Times New Roman" w:cs="Times New Roman" w:eastAsia="Times New Roman" w:hAnsi="Times New Roman"/>
-        </w:rPr>
-        <w:t xml:space="preserve">Xã Hoằng Tiến, tỉnh Thanh Hóa.</w:t>
+        <w:t xml:space="preserve">2. Thành phần ký biên bản nghiệm thu:</w:t>
       </w:r>
     </w:p>
     <w:p>
       <w:pPr>
         <w:keepNext/>
-        <w:spacing w:after="40" w:before="100" w:line="276"/>
+        <w:spacing w:after="40" w:before="40" w:line="276"/>
         <w:jc w:val="both"/>
       </w:pPr>
       <w:r>
@@ -14309,56 +14154,15 @@
           <w:b/>
           <w:bCs/>
         </w:rPr>
-        <w:t xml:space="preserve">1. Đối tượng kiểm tra: </w:t>
-      </w:r>
-    </w:p>
-    <w:p>
-      <w:pPr>
-        <w:tabs>
-          <w:tab w:val="right" w:pos="9072" w:leader="dot"/>
-        </w:tabs>
-        <w:spacing w:after="40" w:before="40" w:line="276"/>
-      </w:pPr>
-      <w:r>
-        <w:rPr>
-          <w:rFonts w:ascii="Times New Roman" w:cs="Times New Roman" w:eastAsia="Times New Roman" w:hAnsi="Times New Roman"/>
-        </w:rPr>
-        <w:t xml:space="preserve"/>
-      </w:r>
-      <w:r>
-        <w:rPr>
-          <w:rFonts w:ascii="Times New Roman" w:cs="Times New Roman" w:eastAsia="Times New Roman" w:hAnsi="Times New Roman"/>
-        </w:rPr>
-        <w:t xml:space="preserve">	</w:t>
-      </w:r>
-    </w:p>
-    <w:p>
-      <w:pPr>
-        <w:keepNext/>
-        <w:spacing w:after="40" w:before="100" w:line="276"/>
-        <w:jc w:val="both"/>
-      </w:pPr>
+        <w:t xml:space="preserve">2.1. Người trực tiếp giám sát thi công xây dựng của chủ đầu tư – </w:t>
+      </w:r>
       <w:r>
         <w:rPr>
           <w:rFonts w:ascii="Times New Roman" w:cs="Times New Roman" w:eastAsia="Times New Roman" w:hAnsi="Times New Roman"/>
           <w:b/>
           <w:bCs/>
         </w:rPr>
-        <w:t xml:space="preserve">2. Thành phần tham gia (Ban chỉ huy công trường – Liên danh Công ty TNHH Hoàng Tuấn – Công ty Cổ phần Đầu tư và Xây dựng Tuấn Linh):</w:t>
-      </w:r>
-    </w:p>
-    <w:p>
-      <w:pPr>
-        <w:spacing w:after="40" w:before="40" w:line="276"/>
-        <w:jc w:val="both"/>
-      </w:pPr>
-      <w:r>
-        <w:rPr>
-          <w:rFonts w:ascii="Times New Roman" w:cs="Times New Roman" w:eastAsia="Times New Roman" w:hAnsi="Times New Roman"/>
-          <w:i/>
-          <w:iCs/>
-        </w:rPr>
-        <w:t xml:space="preserve">(Thành viên liên danh nào thi công phần việc thì thành viên đó lập biên bản kiểm tra nội bộ)</w:t>
+        <w:t xml:space="preserve">Công ty Cổ phần Tư vấn xây dựng Vinasean</w:t>
       </w:r>
     </w:p>
     <w:p>
@@ -14374,13 +14178,13 @@
         <w:rPr>
           <w:rFonts w:ascii="Times New Roman" w:cs="Times New Roman" w:eastAsia="Times New Roman" w:hAnsi="Times New Roman"/>
         </w:rPr>
-        <w:t xml:space="preserve">- Ông (Bà): Đinh Trọng Bình</w:t>
-      </w:r>
-      <w:r>
-        <w:rPr>
-          <w:rFonts w:ascii="Times New Roman" w:cs="Times New Roman" w:eastAsia="Times New Roman" w:hAnsi="Times New Roman"/>
-        </w:rPr>
-        <w:t xml:space="preserve">	Chức vụ: Chỉ huy trưởng</w:t>
+        <w:t xml:space="preserve">- Ông (Bà): Lê Ngọc Đông</w:t>
+      </w:r>
+      <w:r>
+        <w:rPr>
+          <w:rFonts w:ascii="Times New Roman" w:cs="Times New Roman" w:eastAsia="Times New Roman" w:hAnsi="Times New Roman"/>
+        </w:rPr>
+        <w:t xml:space="preserve">	Chức vụ: Tư vấn giám sát viên</w:t>
       </w:r>
     </w:p>
     <w:p>
@@ -14396,6 +14200,66 @@
         <w:rPr>
           <w:rFonts w:ascii="Times New Roman" w:cs="Times New Roman" w:eastAsia="Times New Roman" w:hAnsi="Times New Roman"/>
         </w:rPr>
+        <w:t xml:space="preserve">- Ông (Bà): Lê Đại Dương</w:t>
+      </w:r>
+      <w:r>
+        <w:rPr>
+          <w:rFonts w:ascii="Times New Roman" w:cs="Times New Roman" w:eastAsia="Times New Roman" w:hAnsi="Times New Roman"/>
+        </w:rPr>
+        <w:t xml:space="preserve">	Chức vụ: Tư vấn giám sát viên</w:t>
+      </w:r>
+    </w:p>
+    <w:p>
+      <w:pPr>
+        <w:keepNext/>
+        <w:spacing w:after="40" w:before="40" w:line="276"/>
+        <w:jc w:val="both"/>
+      </w:pPr>
+      <w:r>
+        <w:rPr>
+          <w:rFonts w:ascii="Times New Roman" w:cs="Times New Roman" w:eastAsia="Times New Roman" w:hAnsi="Times New Roman"/>
+          <w:b/>
+          <w:bCs/>
+        </w:rPr>
+        <w:t xml:space="preserve">2.2. Người trực tiếp phụ trách kỹ thuật thi công của nhà thầu – </w:t>
+      </w:r>
+      <w:r>
+        <w:rPr>
+          <w:rFonts w:ascii="Times New Roman" w:cs="Times New Roman" w:eastAsia="Times New Roman" w:hAnsi="Times New Roman"/>
+          <w:b/>
+          <w:bCs/>
+        </w:rPr>
+        <w:t xml:space="preserve">Liên danh Công ty TNHH Hoàng Tuấn – Công ty Cổ phần Đầu tư và Xây dựng Tuấn Linh</w:t>
+      </w:r>
+    </w:p>
+    <w:p>
+      <w:pPr>
+        <w:keepNext/>
+        <w:spacing w:after="40" w:before="40" w:line="276"/>
+        <w:jc w:val="both"/>
+      </w:pPr>
+      <w:r>
+        <w:rPr>
+          <w:rFonts w:ascii="Times New Roman" w:cs="Times New Roman" w:eastAsia="Times New Roman" w:hAnsi="Times New Roman"/>
+          <w:i/>
+          <w:iCs/>
+        </w:rPr>
+        <w:t xml:space="preserve">- Công ty TNHH Hoàng Tuấn:</w:t>
+      </w:r>
+    </w:p>
+    <w:p>
+      <w:pPr>
+        <w:tabs>
+          <w:tab w:val="left" w:pos="4700" w:leader="none"/>
+          <w:tab w:val="right" w:pos="8788" w:leader="dot"/>
+        </w:tabs>
+        <w:spacing w:after="30" w:before="30" w:line="276"/>
+        <w:ind w:left="284"/>
+      </w:pPr>
+      <w:r>
+        <w:rPr>
+          <w:rFonts w:ascii="Times New Roman" w:cs="Times New Roman" w:eastAsia="Times New Roman" w:hAnsi="Times New Roman"/>
+        </w:rPr>
         <w:t xml:space="preserve">- Ông (Bà): Lê Công Trung</w:t>
       </w:r>
       <w:r>
@@ -14403,6 +14267,21 @@
           <w:rFonts w:ascii="Times New Roman" w:cs="Times New Roman" w:eastAsia="Times New Roman" w:hAnsi="Times New Roman"/>
         </w:rPr>
         <w:t xml:space="preserve">	Chức vụ: Cán bộ kỹ thuật thi công trực tiếp</w:t>
+      </w:r>
+    </w:p>
+    <w:p>
+      <w:pPr>
+        <w:keepNext/>
+        <w:spacing w:after="40" w:before="40" w:line="276"/>
+        <w:jc w:val="both"/>
+      </w:pPr>
+      <w:r>
+        <w:rPr>
+          <w:rFonts w:ascii="Times New Roman" w:cs="Times New Roman" w:eastAsia="Times New Roman" w:hAnsi="Times New Roman"/>
+          <w:i/>
+          <w:iCs/>
+        </w:rPr>
+        <w:t xml:space="preserve">- Công ty Cổ phần Đầu tư và Xây dựng Tuấn Linh:</w:t>
       </w:r>
     </w:p>
     <w:p>
@@ -14424,1662 +14303,6 @@
         <w:rPr>
           <w:rFonts w:ascii="Times New Roman" w:cs="Times New Roman" w:eastAsia="Times New Roman" w:hAnsi="Times New Roman"/>
         </w:rPr>
-        <w:t xml:space="preserve">	Chức vụ: Cán bộ QA/QC</w:t>
-      </w:r>
-    </w:p>
-    <w:p>
-      <w:pPr>
-        <w:tabs>
-          <w:tab w:val="left" w:pos="4700" w:leader="dot"/>
-          <w:tab w:val="right" w:pos="8788" w:leader="dot"/>
-        </w:tabs>
-        <w:spacing w:after="30" w:before="30" w:line="276"/>
-        <w:ind w:left="284"/>
-      </w:pPr>
-      <w:r>
-        <w:rPr>
-          <w:rFonts w:ascii="Times New Roman" w:cs="Times New Roman" w:eastAsia="Times New Roman" w:hAnsi="Times New Roman"/>
-        </w:rPr>
-        <w:t xml:space="preserve">- Ông (Bà): </w:t>
-      </w:r>
-      <w:r>
-        <w:rPr>
-          <w:rFonts w:ascii="Times New Roman" w:cs="Times New Roman" w:eastAsia="Times New Roman" w:hAnsi="Times New Roman"/>
-        </w:rPr>
-        <w:t xml:space="preserve">	Chức vụ: Tổ trưởng thi công</w:t>
-      </w:r>
-    </w:p>
-    <w:p>
-      <w:pPr>
-        <w:keepNext/>
-        <w:spacing w:after="40" w:before="100" w:line="276"/>
-        <w:jc w:val="both"/>
-      </w:pPr>
-      <w:r>
-        <w:rPr>
-          <w:rFonts w:ascii="Times New Roman" w:cs="Times New Roman" w:eastAsia="Times New Roman" w:hAnsi="Times New Roman"/>
-          <w:b/>
-          <w:bCs/>
-        </w:rPr>
-        <w:t xml:space="preserve">3. Thời gian, địa điểm:</w:t>
-      </w:r>
-    </w:p>
-    <w:p>
-      <w:pPr>
-        <w:spacing w:after="40" w:before="40" w:line="276"/>
-        <w:ind w:left="284"/>
-        <w:jc w:val="both"/>
-      </w:pPr>
-      <w:r>
-        <w:rPr>
-          <w:rFonts w:ascii="Times New Roman" w:cs="Times New Roman" w:eastAsia="Times New Roman" w:hAnsi="Times New Roman"/>
-        </w:rPr>
-        <w:t xml:space="preserve">Bắt đầu: ..... giờ ..... phút, ngày ..... tháng ..... năm 2026.</w:t>
-      </w:r>
-    </w:p>
-    <w:p>
-      <w:pPr>
-        <w:spacing w:after="40" w:before="40" w:line="276"/>
-        <w:ind w:left="284"/>
-        <w:jc w:val="both"/>
-      </w:pPr>
-      <w:r>
-        <w:rPr>
-          <w:rFonts w:ascii="Times New Roman" w:cs="Times New Roman" w:eastAsia="Times New Roman" w:hAnsi="Times New Roman"/>
-        </w:rPr>
-        <w:t xml:space="preserve">Kết thúc: ..... giờ ..... phút, ngày ..... tháng ..... năm 2026.</w:t>
-      </w:r>
-    </w:p>
-    <w:p>
-      <w:pPr>
-        <w:tabs>
-          <w:tab w:val="right" w:pos="9072" w:leader="dot"/>
-        </w:tabs>
-        <w:spacing w:after="40" w:before="40" w:line="276"/>
-      </w:pPr>
-      <w:r>
-        <w:rPr>
-          <w:rFonts w:ascii="Times New Roman" w:cs="Times New Roman" w:eastAsia="Times New Roman" w:hAnsi="Times New Roman"/>
-        </w:rPr>
-        <w:t xml:space="preserve">Tại: </w:t>
-      </w:r>
-      <w:r>
-        <w:rPr>
-          <w:rFonts w:ascii="Times New Roman" w:cs="Times New Roman" w:eastAsia="Times New Roman" w:hAnsi="Times New Roman"/>
-        </w:rPr>
-        <w:t xml:space="preserve">	</w:t>
-      </w:r>
-    </w:p>
-    <w:p>
-      <w:pPr>
-        <w:keepNext/>
-        <w:spacing w:after="40" w:before="100" w:line="276"/>
-        <w:jc w:val="both"/>
-      </w:pPr>
-      <w:r>
-        <w:rPr>
-          <w:rFonts w:ascii="Times New Roman" w:cs="Times New Roman" w:eastAsia="Times New Roman" w:hAnsi="Times New Roman"/>
-          <w:b/>
-          <w:bCs/>
-        </w:rPr>
-        <w:t xml:space="preserve">4. Kết quả tự kiểm tra:</w:t>
-      </w:r>
-    </w:p>
-    <w:tbl>
-      <w:tblPr>
-        <w:tblW w:type="dxa" w:w="9072"/>
-        <w:tblBorders>
-          <w:top w:val="single" w:color="000000" w:sz="4"/>
-          <w:left w:val="single" w:color="000000" w:sz="4"/>
-          <w:bottom w:val="single" w:color="000000" w:sz="4"/>
-          <w:right w:val="single" w:color="000000" w:sz="4"/>
-          <w:insideH w:val="single" w:color="000000" w:sz="4"/>
-          <w:insideV w:val="single" w:color="000000" w:sz="4"/>
-        </w:tblBorders>
-      </w:tblPr>
-      <w:tblGrid>
-        <w:gridCol w:w="498"/>
-        <w:gridCol w:w="3290"/>
-        <w:gridCol w:w="2692"/>
-        <w:gridCol w:w="1296"/>
-        <w:gridCol w:w="1296"/>
-      </w:tblGrid>
-      <w:tr>
-        <w:trPr>
-          <w:tblHeader/>
-        </w:trPr>
-        <w:tc>
-          <w:tcPr>
-            <w:tcW w:type="dxa" w:w="498"/>
-            <w:shd w:fill="E7E6E6" w:color="auto" w:val="clear"/>
-            <w:tcMar>
-              <w:top w:type="dxa" w:w="40"/>
-              <w:left w:type="dxa" w:w="80"/>
-              <w:bottom w:type="dxa" w:w="40"/>
-              <w:right w:type="dxa" w:w="80"/>
-            </w:tcMar>
-            <w:vAlign w:val="center"/>
-          </w:tcPr>
-          <w:p>
-            <w:pPr>
-              <w:spacing w:after="20" w:before="20" w:line="276"/>
-              <w:jc w:val="center"/>
-            </w:pPr>
-            <w:r>
-              <w:rPr>
-                <w:rFonts w:ascii="Times New Roman" w:cs="Times New Roman" w:eastAsia="Times New Roman" w:hAnsi="Times New Roman"/>
-                <w:b/>
-                <w:bCs/>
-              </w:rPr>
-              <w:t xml:space="preserve">TT</w:t>
-            </w:r>
-          </w:p>
-        </w:tc>
-        <w:tc>
-          <w:tcPr>
-            <w:tcW w:type="dxa" w:w="3290"/>
-            <w:shd w:fill="E7E6E6" w:color="auto" w:val="clear"/>
-            <w:tcMar>
-              <w:top w:type="dxa" w:w="40"/>
-              <w:left w:type="dxa" w:w="80"/>
-              <w:bottom w:type="dxa" w:w="40"/>
-              <w:right w:type="dxa" w:w="80"/>
-            </w:tcMar>
-            <w:vAlign w:val="center"/>
-          </w:tcPr>
-          <w:p>
-            <w:pPr>
-              <w:spacing w:after="20" w:before="20" w:line="276"/>
-              <w:jc w:val="center"/>
-            </w:pPr>
-            <w:r>
-              <w:rPr>
-                <w:rFonts w:ascii="Times New Roman" w:cs="Times New Roman" w:eastAsia="Times New Roman" w:hAnsi="Times New Roman"/>
-                <w:b/>
-                <w:bCs/>
-              </w:rPr>
-              <w:t xml:space="preserve">Nội dung kiểm tra</w:t>
-            </w:r>
-          </w:p>
-        </w:tc>
-        <w:tc>
-          <w:tcPr>
-            <w:tcW w:type="dxa" w:w="2692"/>
-            <w:shd w:fill="E7E6E6" w:color="auto" w:val="clear"/>
-            <w:tcMar>
-              <w:top w:type="dxa" w:w="40"/>
-              <w:left w:type="dxa" w:w="80"/>
-              <w:bottom w:type="dxa" w:w="40"/>
-              <w:right w:type="dxa" w:w="80"/>
-            </w:tcMar>
-            <w:vAlign w:val="center"/>
-          </w:tcPr>
-          <w:p>
-            <w:pPr>
-              <w:spacing w:after="20" w:before="20" w:line="276"/>
-              <w:jc w:val="center"/>
-            </w:pPr>
-            <w:r>
-              <w:rPr>
-                <w:rFonts w:ascii="Times New Roman" w:cs="Times New Roman" w:eastAsia="Times New Roman" w:hAnsi="Times New Roman"/>
-                <w:b/>
-                <w:bCs/>
-              </w:rPr>
-              <w:t xml:space="preserve">Yêu cầu thiết kế / tiêu chuẩn</w:t>
-            </w:r>
-          </w:p>
-        </w:tc>
-        <w:tc>
-          <w:tcPr>
-            <w:tcW w:type="dxa" w:w="1296"/>
-            <w:shd w:fill="E7E6E6" w:color="auto" w:val="clear"/>
-            <w:tcMar>
-              <w:top w:type="dxa" w:w="40"/>
-              <w:left w:type="dxa" w:w="80"/>
-              <w:bottom w:type="dxa" w:w="40"/>
-              <w:right w:type="dxa" w:w="80"/>
-            </w:tcMar>
-            <w:vAlign w:val="center"/>
-          </w:tcPr>
-          <w:p>
-            <w:pPr>
-              <w:spacing w:after="20" w:before="20" w:line="276"/>
-              <w:jc w:val="center"/>
-            </w:pPr>
-            <w:r>
-              <w:rPr>
-                <w:rFonts w:ascii="Times New Roman" w:cs="Times New Roman" w:eastAsia="Times New Roman" w:hAnsi="Times New Roman"/>
-                <w:b/>
-                <w:bCs/>
-              </w:rPr>
-              <w:t xml:space="preserve">Kết quả đo</w:t>
-            </w:r>
-          </w:p>
-        </w:tc>
-        <w:tc>
-          <w:tcPr>
-            <w:tcW w:type="dxa" w:w="1296"/>
-            <w:shd w:fill="E7E6E6" w:color="auto" w:val="clear"/>
-            <w:tcMar>
-              <w:top w:type="dxa" w:w="40"/>
-              <w:left w:type="dxa" w:w="80"/>
-              <w:bottom w:type="dxa" w:w="40"/>
-              <w:right w:type="dxa" w:w="80"/>
-            </w:tcMar>
-            <w:vAlign w:val="center"/>
-          </w:tcPr>
-          <w:p>
-            <w:pPr>
-              <w:spacing w:after="20" w:before="20" w:line="276"/>
-              <w:jc w:val="center"/>
-            </w:pPr>
-            <w:r>
-              <w:rPr>
-                <w:rFonts w:ascii="Times New Roman" w:cs="Times New Roman" w:eastAsia="Times New Roman" w:hAnsi="Times New Roman"/>
-                <w:b/>
-                <w:bCs/>
-              </w:rPr>
-              <w:t xml:space="preserve">Đánh giá</w:t>
-            </w:r>
-          </w:p>
-        </w:tc>
-      </w:tr>
-      <w:tr>
-        <w:tc>
-          <w:tcPr>
-            <w:tcW w:type="dxa" w:w="498"/>
-            <w:tcMar>
-              <w:top w:type="dxa" w:w="40"/>
-              <w:left w:type="dxa" w:w="80"/>
-              <w:bottom w:type="dxa" w:w="40"/>
-              <w:right w:type="dxa" w:w="80"/>
-            </w:tcMar>
-            <w:vAlign w:val="center"/>
-          </w:tcPr>
-          <w:p>
-            <w:pPr>
-              <w:spacing w:after="20" w:before="20" w:line="276"/>
-              <w:jc w:val="center"/>
-            </w:pPr>
-            <w:r>
-              <w:rPr>
-                <w:rFonts w:ascii="Times New Roman" w:cs="Times New Roman" w:eastAsia="Times New Roman" w:hAnsi="Times New Roman"/>
-              </w:rPr>
-              <w:t xml:space="preserve">1</w:t>
-            </w:r>
-          </w:p>
-        </w:tc>
-        <w:tc>
-          <w:tcPr>
-            <w:tcW w:type="dxa" w:w="3290"/>
-            <w:tcMar>
-              <w:top w:type="dxa" w:w="40"/>
-              <w:left w:type="dxa" w:w="80"/>
-              <w:bottom w:type="dxa" w:w="40"/>
-              <w:right w:type="dxa" w:w="80"/>
-            </w:tcMar>
-            <w:vAlign w:val="center"/>
-          </w:tcPr>
-          <w:p>
-            <w:pPr>
-              <w:spacing w:after="20" w:before="20" w:line="276"/>
-              <w:jc w:val="left"/>
-            </w:pPr>
-            <w:r>
-              <w:rPr>
-                <w:rFonts w:ascii="Times New Roman" w:cs="Times New Roman" w:eastAsia="Times New Roman" w:hAnsi="Times New Roman"/>
-              </w:rPr>
-              <w:t xml:space="preserve">Vị trí, tim tuyến, cao độ</w:t>
-            </w:r>
-          </w:p>
-        </w:tc>
-        <w:tc>
-          <w:tcPr>
-            <w:tcW w:type="dxa" w:w="2692"/>
-            <w:tcMar>
-              <w:top w:type="dxa" w:w="40"/>
-              <w:left w:type="dxa" w:w="80"/>
-              <w:bottom w:type="dxa" w:w="40"/>
-              <w:right w:type="dxa" w:w="80"/>
-            </w:tcMar>
-            <w:vAlign w:val="center"/>
-          </w:tcPr>
-          <w:p>
-            <w:pPr>
-              <w:spacing w:after="20" w:before="20" w:line="276"/>
-              <w:jc w:val="left"/>
-            </w:pPr>
-            <w:r>
-              <w:rPr>
-                <w:rFonts w:ascii="Times New Roman" w:cs="Times New Roman" w:eastAsia="Times New Roman" w:hAnsi="Times New Roman"/>
-              </w:rPr>
-              <w:t xml:space="preserve"/>
-            </w:r>
-          </w:p>
-        </w:tc>
-        <w:tc>
-          <w:tcPr>
-            <w:tcW w:type="dxa" w:w="1296"/>
-            <w:tcMar>
-              <w:top w:type="dxa" w:w="40"/>
-              <w:left w:type="dxa" w:w="80"/>
-              <w:bottom w:type="dxa" w:w="40"/>
-              <w:right w:type="dxa" w:w="80"/>
-            </w:tcMar>
-            <w:vAlign w:val="center"/>
-          </w:tcPr>
-          <w:p>
-            <w:pPr>
-              <w:spacing w:after="20" w:before="20" w:line="276"/>
-              <w:jc w:val="left"/>
-            </w:pPr>
-            <w:r>
-              <w:rPr>
-                <w:rFonts w:ascii="Times New Roman" w:cs="Times New Roman" w:eastAsia="Times New Roman" w:hAnsi="Times New Roman"/>
-              </w:rPr>
-              <w:t xml:space="preserve"/>
-            </w:r>
-          </w:p>
-        </w:tc>
-        <w:tc>
-          <w:tcPr>
-            <w:tcW w:type="dxa" w:w="1296"/>
-            <w:tcMar>
-              <w:top w:type="dxa" w:w="40"/>
-              <w:left w:type="dxa" w:w="80"/>
-              <w:bottom w:type="dxa" w:w="40"/>
-              <w:right w:type="dxa" w:w="80"/>
-            </w:tcMar>
-            <w:vAlign w:val="center"/>
-          </w:tcPr>
-          <w:p>
-            <w:pPr>
-              <w:spacing w:after="20" w:before="20" w:line="276"/>
-              <w:jc w:val="left"/>
-            </w:pPr>
-            <w:r>
-              <w:rPr>
-                <w:rFonts w:ascii="Times New Roman" w:cs="Times New Roman" w:eastAsia="Times New Roman" w:hAnsi="Times New Roman"/>
-              </w:rPr>
-              <w:t xml:space="preserve"/>
-            </w:r>
-          </w:p>
-        </w:tc>
-      </w:tr>
-      <w:tr>
-        <w:tc>
-          <w:tcPr>
-            <w:tcW w:type="dxa" w:w="498"/>
-            <w:tcMar>
-              <w:top w:type="dxa" w:w="40"/>
-              <w:left w:type="dxa" w:w="80"/>
-              <w:bottom w:type="dxa" w:w="40"/>
-              <w:right w:type="dxa" w:w="80"/>
-            </w:tcMar>
-            <w:vAlign w:val="center"/>
-          </w:tcPr>
-          <w:p>
-            <w:pPr>
-              <w:spacing w:after="20" w:before="20" w:line="276"/>
-              <w:jc w:val="center"/>
-            </w:pPr>
-            <w:r>
-              <w:rPr>
-                <w:rFonts w:ascii="Times New Roman" w:cs="Times New Roman" w:eastAsia="Times New Roman" w:hAnsi="Times New Roman"/>
-              </w:rPr>
-              <w:t xml:space="preserve">2</w:t>
-            </w:r>
-          </w:p>
-        </w:tc>
-        <w:tc>
-          <w:tcPr>
-            <w:tcW w:type="dxa" w:w="3290"/>
-            <w:tcMar>
-              <w:top w:type="dxa" w:w="40"/>
-              <w:left w:type="dxa" w:w="80"/>
-              <w:bottom w:type="dxa" w:w="40"/>
-              <w:right w:type="dxa" w:w="80"/>
-            </w:tcMar>
-            <w:vAlign w:val="center"/>
-          </w:tcPr>
-          <w:p>
-            <w:pPr>
-              <w:spacing w:after="20" w:before="20" w:line="276"/>
-              <w:jc w:val="left"/>
-            </w:pPr>
-            <w:r>
-              <w:rPr>
-                <w:rFonts w:ascii="Times New Roman" w:cs="Times New Roman" w:eastAsia="Times New Roman" w:hAnsi="Times New Roman"/>
-              </w:rPr>
-              <w:t xml:space="preserve">Kích thước hình học</w:t>
-            </w:r>
-          </w:p>
-        </w:tc>
-        <w:tc>
-          <w:tcPr>
-            <w:tcW w:type="dxa" w:w="2692"/>
-            <w:tcMar>
-              <w:top w:type="dxa" w:w="40"/>
-              <w:left w:type="dxa" w:w="80"/>
-              <w:bottom w:type="dxa" w:w="40"/>
-              <w:right w:type="dxa" w:w="80"/>
-            </w:tcMar>
-            <w:vAlign w:val="center"/>
-          </w:tcPr>
-          <w:p>
-            <w:pPr>
-              <w:spacing w:after="20" w:before="20" w:line="276"/>
-              <w:jc w:val="left"/>
-            </w:pPr>
-            <w:r>
-              <w:rPr>
-                <w:rFonts w:ascii="Times New Roman" w:cs="Times New Roman" w:eastAsia="Times New Roman" w:hAnsi="Times New Roman"/>
-              </w:rPr>
-              <w:t xml:space="preserve"/>
-            </w:r>
-          </w:p>
-        </w:tc>
-        <w:tc>
-          <w:tcPr>
-            <w:tcW w:type="dxa" w:w="1296"/>
-            <w:tcMar>
-              <w:top w:type="dxa" w:w="40"/>
-              <w:left w:type="dxa" w:w="80"/>
-              <w:bottom w:type="dxa" w:w="40"/>
-              <w:right w:type="dxa" w:w="80"/>
-            </w:tcMar>
-            <w:vAlign w:val="center"/>
-          </w:tcPr>
-          <w:p>
-            <w:pPr>
-              <w:spacing w:after="20" w:before="20" w:line="276"/>
-              <w:jc w:val="left"/>
-            </w:pPr>
-            <w:r>
-              <w:rPr>
-                <w:rFonts w:ascii="Times New Roman" w:cs="Times New Roman" w:eastAsia="Times New Roman" w:hAnsi="Times New Roman"/>
-              </w:rPr>
-              <w:t xml:space="preserve"/>
-            </w:r>
-          </w:p>
-        </w:tc>
-        <w:tc>
-          <w:tcPr>
-            <w:tcW w:type="dxa" w:w="1296"/>
-            <w:tcMar>
-              <w:top w:type="dxa" w:w="40"/>
-              <w:left w:type="dxa" w:w="80"/>
-              <w:bottom w:type="dxa" w:w="40"/>
-              <w:right w:type="dxa" w:w="80"/>
-            </w:tcMar>
-            <w:vAlign w:val="center"/>
-          </w:tcPr>
-          <w:p>
-            <w:pPr>
-              <w:spacing w:after="20" w:before="20" w:line="276"/>
-              <w:jc w:val="left"/>
-            </w:pPr>
-            <w:r>
-              <w:rPr>
-                <w:rFonts w:ascii="Times New Roman" w:cs="Times New Roman" w:eastAsia="Times New Roman" w:hAnsi="Times New Roman"/>
-              </w:rPr>
-              <w:t xml:space="preserve"/>
-            </w:r>
-          </w:p>
-        </w:tc>
-      </w:tr>
-      <w:tr>
-        <w:tc>
-          <w:tcPr>
-            <w:tcW w:type="dxa" w:w="498"/>
-            <w:tcMar>
-              <w:top w:type="dxa" w:w="40"/>
-              <w:left w:type="dxa" w:w="80"/>
-              <w:bottom w:type="dxa" w:w="40"/>
-              <w:right w:type="dxa" w:w="80"/>
-            </w:tcMar>
-            <w:vAlign w:val="center"/>
-          </w:tcPr>
-          <w:p>
-            <w:pPr>
-              <w:spacing w:after="20" w:before="20" w:line="276"/>
-              <w:jc w:val="center"/>
-            </w:pPr>
-            <w:r>
-              <w:rPr>
-                <w:rFonts w:ascii="Times New Roman" w:cs="Times New Roman" w:eastAsia="Times New Roman" w:hAnsi="Times New Roman"/>
-              </w:rPr>
-              <w:t xml:space="preserve">3</w:t>
-            </w:r>
-          </w:p>
-        </w:tc>
-        <w:tc>
-          <w:tcPr>
-            <w:tcW w:type="dxa" w:w="3290"/>
-            <w:tcMar>
-              <w:top w:type="dxa" w:w="40"/>
-              <w:left w:type="dxa" w:w="80"/>
-              <w:bottom w:type="dxa" w:w="40"/>
-              <w:right w:type="dxa" w:w="80"/>
-            </w:tcMar>
-            <w:vAlign w:val="center"/>
-          </w:tcPr>
-          <w:p>
-            <w:pPr>
-              <w:spacing w:after="20" w:before="20" w:line="276"/>
-              <w:jc w:val="left"/>
-            </w:pPr>
-            <w:r>
-              <w:rPr>
-                <w:rFonts w:ascii="Times New Roman" w:cs="Times New Roman" w:eastAsia="Times New Roman" w:hAnsi="Times New Roman"/>
-              </w:rPr>
-              <w:t xml:space="preserve">Vật liệu sử dụng (đã được nghiệm thu)</w:t>
-            </w:r>
-          </w:p>
-        </w:tc>
-        <w:tc>
-          <w:tcPr>
-            <w:tcW w:type="dxa" w:w="2692"/>
-            <w:tcMar>
-              <w:top w:type="dxa" w:w="40"/>
-              <w:left w:type="dxa" w:w="80"/>
-              <w:bottom w:type="dxa" w:w="40"/>
-              <w:right w:type="dxa" w:w="80"/>
-            </w:tcMar>
-            <w:vAlign w:val="center"/>
-          </w:tcPr>
-          <w:p>
-            <w:pPr>
-              <w:spacing w:after="20" w:before="20" w:line="276"/>
-              <w:jc w:val="left"/>
-            </w:pPr>
-            <w:r>
-              <w:rPr>
-                <w:rFonts w:ascii="Times New Roman" w:cs="Times New Roman" w:eastAsia="Times New Roman" w:hAnsi="Times New Roman"/>
-              </w:rPr>
-              <w:t xml:space="preserve"/>
-            </w:r>
-          </w:p>
-        </w:tc>
-        <w:tc>
-          <w:tcPr>
-            <w:tcW w:type="dxa" w:w="1296"/>
-            <w:tcMar>
-              <w:top w:type="dxa" w:w="40"/>
-              <w:left w:type="dxa" w:w="80"/>
-              <w:bottom w:type="dxa" w:w="40"/>
-              <w:right w:type="dxa" w:w="80"/>
-            </w:tcMar>
-            <w:vAlign w:val="center"/>
-          </w:tcPr>
-          <w:p>
-            <w:pPr>
-              <w:spacing w:after="20" w:before="20" w:line="276"/>
-              <w:jc w:val="left"/>
-            </w:pPr>
-            <w:r>
-              <w:rPr>
-                <w:rFonts w:ascii="Times New Roman" w:cs="Times New Roman" w:eastAsia="Times New Roman" w:hAnsi="Times New Roman"/>
-              </w:rPr>
-              <w:t xml:space="preserve"/>
-            </w:r>
-          </w:p>
-        </w:tc>
-        <w:tc>
-          <w:tcPr>
-            <w:tcW w:type="dxa" w:w="1296"/>
-            <w:tcMar>
-              <w:top w:type="dxa" w:w="40"/>
-              <w:left w:type="dxa" w:w="80"/>
-              <w:bottom w:type="dxa" w:w="40"/>
-              <w:right w:type="dxa" w:w="80"/>
-            </w:tcMar>
-            <w:vAlign w:val="center"/>
-          </w:tcPr>
-          <w:p>
-            <w:pPr>
-              <w:spacing w:after="20" w:before="20" w:line="276"/>
-              <w:jc w:val="left"/>
-            </w:pPr>
-            <w:r>
-              <w:rPr>
-                <w:rFonts w:ascii="Times New Roman" w:cs="Times New Roman" w:eastAsia="Times New Roman" w:hAnsi="Times New Roman"/>
-              </w:rPr>
-              <w:t xml:space="preserve"/>
-            </w:r>
-          </w:p>
-        </w:tc>
-      </w:tr>
-      <w:tr>
-        <w:tc>
-          <w:tcPr>
-            <w:tcW w:type="dxa" w:w="498"/>
-            <w:tcMar>
-              <w:top w:type="dxa" w:w="40"/>
-              <w:left w:type="dxa" w:w="80"/>
-              <w:bottom w:type="dxa" w:w="40"/>
-              <w:right w:type="dxa" w:w="80"/>
-            </w:tcMar>
-            <w:vAlign w:val="center"/>
-          </w:tcPr>
-          <w:p>
-            <w:pPr>
-              <w:spacing w:after="20" w:before="20" w:line="276"/>
-              <w:jc w:val="center"/>
-            </w:pPr>
-            <w:r>
-              <w:rPr>
-                <w:rFonts w:ascii="Times New Roman" w:cs="Times New Roman" w:eastAsia="Times New Roman" w:hAnsi="Times New Roman"/>
-              </w:rPr>
-              <w:t xml:space="preserve">4</w:t>
-            </w:r>
-          </w:p>
-        </w:tc>
-        <w:tc>
-          <w:tcPr>
-            <w:tcW w:type="dxa" w:w="3290"/>
-            <w:tcMar>
-              <w:top w:type="dxa" w:w="40"/>
-              <w:left w:type="dxa" w:w="80"/>
-              <w:bottom w:type="dxa" w:w="40"/>
-              <w:right w:type="dxa" w:w="80"/>
-            </w:tcMar>
-            <w:vAlign w:val="center"/>
-          </w:tcPr>
-          <w:p>
-            <w:pPr>
-              <w:spacing w:after="20" w:before="20" w:line="276"/>
-              <w:jc w:val="left"/>
-            </w:pPr>
-            <w:r>
-              <w:rPr>
-                <w:rFonts w:ascii="Times New Roman" w:cs="Times New Roman" w:eastAsia="Times New Roman" w:hAnsi="Times New Roman"/>
-              </w:rPr>
-              <w:t xml:space="preserve">Kết quả thí nghiệm hiện trường</w:t>
-            </w:r>
-          </w:p>
-        </w:tc>
-        <w:tc>
-          <w:tcPr>
-            <w:tcW w:type="dxa" w:w="2692"/>
-            <w:tcMar>
-              <w:top w:type="dxa" w:w="40"/>
-              <w:left w:type="dxa" w:w="80"/>
-              <w:bottom w:type="dxa" w:w="40"/>
-              <w:right w:type="dxa" w:w="80"/>
-            </w:tcMar>
-            <w:vAlign w:val="center"/>
-          </w:tcPr>
-          <w:p>
-            <w:pPr>
-              <w:spacing w:after="20" w:before="20" w:line="276"/>
-              <w:jc w:val="left"/>
-            </w:pPr>
-            <w:r>
-              <w:rPr>
-                <w:rFonts w:ascii="Times New Roman" w:cs="Times New Roman" w:eastAsia="Times New Roman" w:hAnsi="Times New Roman"/>
-              </w:rPr>
-              <w:t xml:space="preserve"/>
-            </w:r>
-          </w:p>
-        </w:tc>
-        <w:tc>
-          <w:tcPr>
-            <w:tcW w:type="dxa" w:w="1296"/>
-            <w:tcMar>
-              <w:top w:type="dxa" w:w="40"/>
-              <w:left w:type="dxa" w:w="80"/>
-              <w:bottom w:type="dxa" w:w="40"/>
-              <w:right w:type="dxa" w:w="80"/>
-            </w:tcMar>
-            <w:vAlign w:val="center"/>
-          </w:tcPr>
-          <w:p>
-            <w:pPr>
-              <w:spacing w:after="20" w:before="20" w:line="276"/>
-              <w:jc w:val="left"/>
-            </w:pPr>
-            <w:r>
-              <w:rPr>
-                <w:rFonts w:ascii="Times New Roman" w:cs="Times New Roman" w:eastAsia="Times New Roman" w:hAnsi="Times New Roman"/>
-              </w:rPr>
-              <w:t xml:space="preserve"/>
-            </w:r>
-          </w:p>
-        </w:tc>
-        <w:tc>
-          <w:tcPr>
-            <w:tcW w:type="dxa" w:w="1296"/>
-            <w:tcMar>
-              <w:top w:type="dxa" w:w="40"/>
-              <w:left w:type="dxa" w:w="80"/>
-              <w:bottom w:type="dxa" w:w="40"/>
-              <w:right w:type="dxa" w:w="80"/>
-            </w:tcMar>
-            <w:vAlign w:val="center"/>
-          </w:tcPr>
-          <w:p>
-            <w:pPr>
-              <w:spacing w:after="20" w:before="20" w:line="276"/>
-              <w:jc w:val="left"/>
-            </w:pPr>
-            <w:r>
-              <w:rPr>
-                <w:rFonts w:ascii="Times New Roman" w:cs="Times New Roman" w:eastAsia="Times New Roman" w:hAnsi="Times New Roman"/>
-              </w:rPr>
-              <w:t xml:space="preserve"/>
-            </w:r>
-          </w:p>
-        </w:tc>
-      </w:tr>
-      <w:tr>
-        <w:tc>
-          <w:tcPr>
-            <w:tcW w:type="dxa" w:w="498"/>
-            <w:tcMar>
-              <w:top w:type="dxa" w:w="40"/>
-              <w:left w:type="dxa" w:w="80"/>
-              <w:bottom w:type="dxa" w:w="40"/>
-              <w:right w:type="dxa" w:w="80"/>
-            </w:tcMar>
-            <w:vAlign w:val="center"/>
-          </w:tcPr>
-          <w:p>
-            <w:pPr>
-              <w:spacing w:after="20" w:before="20" w:line="276"/>
-              <w:jc w:val="center"/>
-            </w:pPr>
-            <w:r>
-              <w:rPr>
-                <w:rFonts w:ascii="Times New Roman" w:cs="Times New Roman" w:eastAsia="Times New Roman" w:hAnsi="Times New Roman"/>
-              </w:rPr>
-              <w:t xml:space="preserve">5</w:t>
-            </w:r>
-          </w:p>
-        </w:tc>
-        <w:tc>
-          <w:tcPr>
-            <w:tcW w:type="dxa" w:w="3290"/>
-            <w:tcMar>
-              <w:top w:type="dxa" w:w="40"/>
-              <w:left w:type="dxa" w:w="80"/>
-              <w:bottom w:type="dxa" w:w="40"/>
-              <w:right w:type="dxa" w:w="80"/>
-            </w:tcMar>
-            <w:vAlign w:val="center"/>
-          </w:tcPr>
-          <w:p>
-            <w:pPr>
-              <w:spacing w:after="20" w:before="20" w:line="276"/>
-              <w:jc w:val="left"/>
-            </w:pPr>
-            <w:r>
-              <w:rPr>
-                <w:rFonts w:ascii="Times New Roman" w:cs="Times New Roman" w:eastAsia="Times New Roman" w:hAnsi="Times New Roman"/>
-              </w:rPr>
-              <w:t xml:space="preserve">Hồ sơ hoàn công, nhật ký thi công</w:t>
-            </w:r>
-          </w:p>
-        </w:tc>
-        <w:tc>
-          <w:tcPr>
-            <w:tcW w:type="dxa" w:w="2692"/>
-            <w:tcMar>
-              <w:top w:type="dxa" w:w="40"/>
-              <w:left w:type="dxa" w:w="80"/>
-              <w:bottom w:type="dxa" w:w="40"/>
-              <w:right w:type="dxa" w:w="80"/>
-            </w:tcMar>
-            <w:vAlign w:val="center"/>
-          </w:tcPr>
-          <w:p>
-            <w:pPr>
-              <w:spacing w:after="20" w:before="20" w:line="276"/>
-              <w:jc w:val="left"/>
-            </w:pPr>
-            <w:r>
-              <w:rPr>
-                <w:rFonts w:ascii="Times New Roman" w:cs="Times New Roman" w:eastAsia="Times New Roman" w:hAnsi="Times New Roman"/>
-              </w:rPr>
-              <w:t xml:space="preserve"/>
-            </w:r>
-          </w:p>
-        </w:tc>
-        <w:tc>
-          <w:tcPr>
-            <w:tcW w:type="dxa" w:w="1296"/>
-            <w:tcMar>
-              <w:top w:type="dxa" w:w="40"/>
-              <w:left w:type="dxa" w:w="80"/>
-              <w:bottom w:type="dxa" w:w="40"/>
-              <w:right w:type="dxa" w:w="80"/>
-            </w:tcMar>
-            <w:vAlign w:val="center"/>
-          </w:tcPr>
-          <w:p>
-            <w:pPr>
-              <w:spacing w:after="20" w:before="20" w:line="276"/>
-              <w:jc w:val="left"/>
-            </w:pPr>
-            <w:r>
-              <w:rPr>
-                <w:rFonts w:ascii="Times New Roman" w:cs="Times New Roman" w:eastAsia="Times New Roman" w:hAnsi="Times New Roman"/>
-              </w:rPr>
-              <w:t xml:space="preserve"/>
-            </w:r>
-          </w:p>
-        </w:tc>
-        <w:tc>
-          <w:tcPr>
-            <w:tcW w:type="dxa" w:w="1296"/>
-            <w:tcMar>
-              <w:top w:type="dxa" w:w="40"/>
-              <w:left w:type="dxa" w:w="80"/>
-              <w:bottom w:type="dxa" w:w="40"/>
-              <w:right w:type="dxa" w:w="80"/>
-            </w:tcMar>
-            <w:vAlign w:val="center"/>
-          </w:tcPr>
-          <w:p>
-            <w:pPr>
-              <w:spacing w:after="20" w:before="20" w:line="276"/>
-              <w:jc w:val="left"/>
-            </w:pPr>
-            <w:r>
-              <w:rPr>
-                <w:rFonts w:ascii="Times New Roman" w:cs="Times New Roman" w:eastAsia="Times New Roman" w:hAnsi="Times New Roman"/>
-              </w:rPr>
-              <w:t xml:space="preserve"/>
-            </w:r>
-          </w:p>
-        </w:tc>
-      </w:tr>
-    </w:tbl>
-    <w:p>
-      <w:pPr>
-        <w:keepNext/>
-        <w:spacing w:after="40" w:before="100" w:line="276"/>
-        <w:jc w:val="both"/>
-      </w:pPr>
-      <w:r>
-        <w:rPr>
-          <w:rFonts w:ascii="Times New Roman" w:cs="Times New Roman" w:eastAsia="Times New Roman" w:hAnsi="Times New Roman"/>
-          <w:b/>
-          <w:bCs/>
-        </w:rPr>
-        <w:t xml:space="preserve">5. Kết luận:</w:t>
-      </w:r>
-    </w:p>
-    <w:p>
-      <w:pPr>
-        <w:spacing w:after="40" w:before="40" w:line="276"/>
-        <w:jc w:val="both"/>
-      </w:pPr>
-      <w:r>
-        <w:rPr>
-          <w:rFonts w:ascii="Times New Roman" w:cs="Times New Roman" w:eastAsia="Times New Roman" w:hAnsi="Times New Roman"/>
-        </w:rPr>
-        <w:t xml:space="preserve">□ Đạt yêu cầu, đề nghị Tư vấn giám sát nghiệm thu.       □ Chưa đạt, tiếp tục hoàn thiện: </w:t>
-      </w:r>
-    </w:p>
-    <w:p>
-      <w:pPr>
-        <w:tabs>
-          <w:tab w:val="right" w:pos="9072" w:leader="dot"/>
-        </w:tabs>
-        <w:spacing w:after="40" w:before="40" w:line="276"/>
-      </w:pPr>
-      <w:r>
-        <w:rPr>
-          <w:rFonts w:ascii="Times New Roman" w:cs="Times New Roman" w:eastAsia="Times New Roman" w:hAnsi="Times New Roman"/>
-        </w:rPr>
-        <w:t xml:space="preserve"/>
-      </w:r>
-      <w:r>
-        <w:rPr>
-          <w:rFonts w:ascii="Times New Roman" w:cs="Times New Roman" w:eastAsia="Times New Roman" w:hAnsi="Times New Roman"/>
-        </w:rPr>
-        <w:t xml:space="preserve">	</w:t>
-      </w:r>
-    </w:p>
-    <w:tbl>
-      <w:tblPr>
-        <w:tblW w:type="dxa" w:w="9072"/>
-        <w:tblBorders>
-          <w:top w:val="none" w:color="FFFFFF" w:sz="0"/>
-          <w:left w:val="none" w:color="FFFFFF" w:sz="0"/>
-          <w:bottom w:val="none" w:color="FFFFFF" w:sz="0"/>
-          <w:right w:val="none" w:color="FFFFFF" w:sz="0"/>
-          <w:insideH w:val="none" w:color="FFFFFF" w:sz="0"/>
-          <w:insideV w:val="none" w:color="FFFFFF" w:sz="0"/>
-        </w:tblBorders>
-      </w:tblPr>
-      <w:tblGrid>
-        <w:gridCol w:w="3024"/>
-        <w:gridCol w:w="3024"/>
-        <w:gridCol w:w="3024"/>
-      </w:tblGrid>
-      <w:tr>
-        <w:trPr>
-          <w:cantSplit/>
-        </w:trPr>
-        <w:tc>
-          <w:tcPr>
-            <w:tcW w:type="dxa" w:w="3024"/>
-            <w:tcMar>
-              <w:top w:type="dxa" w:w="40"/>
-              <w:left w:type="dxa" w:w="80"/>
-              <w:bottom w:type="dxa" w:w="40"/>
-              <w:right w:type="dxa" w:w="80"/>
-            </w:tcMar>
-            <w:vAlign w:val="top"/>
-          </w:tcPr>
-          <w:p>
-            <w:pPr>
-              <w:spacing w:after="0" w:before="120" w:line="276"/>
-              <w:jc w:val="center"/>
-            </w:pPr>
-            <w:r>
-              <w:rPr>
-                <w:rFonts w:ascii="Times New Roman" w:cs="Times New Roman" w:eastAsia="Times New Roman" w:hAnsi="Times New Roman"/>
-                <w:b/>
-                <w:bCs/>
-              </w:rPr>
-              <w:t xml:space="preserve">CÁN BỘ KỸ THUẬT</w:t>
-            </w:r>
-          </w:p>
-          <w:p>
-            <w:pPr>
-              <w:spacing w:after="0" w:before="0" w:line="276"/>
-              <w:jc w:val="center"/>
-            </w:pPr>
-            <w:r>
-              <w:rPr>
-                <w:rFonts w:ascii="Times New Roman" w:cs="Times New Roman" w:eastAsia="Times New Roman" w:hAnsi="Times New Roman"/>
-                <w:i/>
-                <w:iCs/>
-              </w:rPr>
-              <w:t xml:space="preserve">(Ký, ghi rõ họ tên, chức vụ)</w:t>
-            </w:r>
-          </w:p>
-          <w:p>
-            <w:pPr>
-              <w:spacing w:after="40" w:before="40" w:line="276"/>
-              <w:jc w:val="both"/>
-            </w:pPr>
-            <w:r>
-              <w:rPr>
-                <w:rFonts w:ascii="Times New Roman" w:cs="Times New Roman" w:eastAsia="Times New Roman" w:hAnsi="Times New Roman"/>
-              </w:rPr>
-              <w:t xml:space="preserve"/>
-            </w:r>
-          </w:p>
-          <w:p>
-            <w:pPr>
-              <w:spacing w:after="40" w:before="40" w:line="276"/>
-              <w:jc w:val="both"/>
-            </w:pPr>
-            <w:r>
-              <w:rPr>
-                <w:rFonts w:ascii="Times New Roman" w:cs="Times New Roman" w:eastAsia="Times New Roman" w:hAnsi="Times New Roman"/>
-              </w:rPr>
-              <w:t xml:space="preserve"/>
-            </w:r>
-          </w:p>
-          <w:p>
-            <w:pPr>
-              <w:spacing w:after="40" w:before="40" w:line="276"/>
-              <w:jc w:val="both"/>
-            </w:pPr>
-            <w:r>
-              <w:rPr>
-                <w:rFonts w:ascii="Times New Roman" w:cs="Times New Roman" w:eastAsia="Times New Roman" w:hAnsi="Times New Roman"/>
-              </w:rPr>
-              <w:t xml:space="preserve"/>
-            </w:r>
-          </w:p>
-          <w:p>
-            <w:pPr>
-              <w:spacing w:after="40" w:before="40" w:line="276"/>
-              <w:jc w:val="both"/>
-            </w:pPr>
-            <w:r>
-              <w:rPr>
-                <w:rFonts w:ascii="Times New Roman" w:cs="Times New Roman" w:eastAsia="Times New Roman" w:hAnsi="Times New Roman"/>
-              </w:rPr>
-              <w:t xml:space="preserve"/>
-            </w:r>
-          </w:p>
-          <w:p>
-            <w:pPr>
-              <w:spacing w:after="120" w:before="0" w:line="276"/>
-              <w:jc w:val="center"/>
-            </w:pPr>
-            <w:r>
-              <w:rPr>
-                <w:rFonts w:ascii="Times New Roman" w:cs="Times New Roman" w:eastAsia="Times New Roman" w:hAnsi="Times New Roman"/>
-                <w:b/>
-                <w:bCs/>
-              </w:rPr>
-              <w:t xml:space="preserve">Lê Công Trung</w:t>
-            </w:r>
-          </w:p>
-        </w:tc>
-        <w:tc>
-          <w:tcPr>
-            <w:tcW w:type="dxa" w:w="3024"/>
-            <w:tcMar>
-              <w:top w:type="dxa" w:w="40"/>
-              <w:left w:type="dxa" w:w="80"/>
-              <w:bottom w:type="dxa" w:w="40"/>
-              <w:right w:type="dxa" w:w="80"/>
-            </w:tcMar>
-            <w:vAlign w:val="top"/>
-          </w:tcPr>
-          <w:p>
-            <w:pPr>
-              <w:spacing w:after="0" w:before="120" w:line="276"/>
-              <w:jc w:val="center"/>
-            </w:pPr>
-            <w:r>
-              <w:rPr>
-                <w:rFonts w:ascii="Times New Roman" w:cs="Times New Roman" w:eastAsia="Times New Roman" w:hAnsi="Times New Roman"/>
-                <w:b/>
-                <w:bCs/>
-              </w:rPr>
-              <w:t xml:space="preserve">CÁN BỘ QA/QC</w:t>
-            </w:r>
-          </w:p>
-          <w:p>
-            <w:pPr>
-              <w:spacing w:after="0" w:before="0" w:line="276"/>
-              <w:jc w:val="center"/>
-            </w:pPr>
-            <w:r>
-              <w:rPr>
-                <w:rFonts w:ascii="Times New Roman" w:cs="Times New Roman" w:eastAsia="Times New Roman" w:hAnsi="Times New Roman"/>
-                <w:i/>
-                <w:iCs/>
-              </w:rPr>
-              <w:t xml:space="preserve">(Ký, ghi rõ họ tên, chức vụ)</w:t>
-            </w:r>
-          </w:p>
-          <w:p>
-            <w:pPr>
-              <w:spacing w:after="40" w:before="40" w:line="276"/>
-              <w:jc w:val="both"/>
-            </w:pPr>
-            <w:r>
-              <w:rPr>
-                <w:rFonts w:ascii="Times New Roman" w:cs="Times New Roman" w:eastAsia="Times New Roman" w:hAnsi="Times New Roman"/>
-              </w:rPr>
-              <w:t xml:space="preserve"/>
-            </w:r>
-          </w:p>
-          <w:p>
-            <w:pPr>
-              <w:spacing w:after="40" w:before="40" w:line="276"/>
-              <w:jc w:val="both"/>
-            </w:pPr>
-            <w:r>
-              <w:rPr>
-                <w:rFonts w:ascii="Times New Roman" w:cs="Times New Roman" w:eastAsia="Times New Roman" w:hAnsi="Times New Roman"/>
-              </w:rPr>
-              <w:t xml:space="preserve"/>
-            </w:r>
-          </w:p>
-          <w:p>
-            <w:pPr>
-              <w:spacing w:after="40" w:before="40" w:line="276"/>
-              <w:jc w:val="both"/>
-            </w:pPr>
-            <w:r>
-              <w:rPr>
-                <w:rFonts w:ascii="Times New Roman" w:cs="Times New Roman" w:eastAsia="Times New Roman" w:hAnsi="Times New Roman"/>
-              </w:rPr>
-              <w:t xml:space="preserve"/>
-            </w:r>
-          </w:p>
-          <w:p>
-            <w:pPr>
-              <w:spacing w:after="40" w:before="40" w:line="276"/>
-              <w:jc w:val="both"/>
-            </w:pPr>
-            <w:r>
-              <w:rPr>
-                <w:rFonts w:ascii="Times New Roman" w:cs="Times New Roman" w:eastAsia="Times New Roman" w:hAnsi="Times New Roman"/>
-              </w:rPr>
-              <w:t xml:space="preserve"/>
-            </w:r>
-          </w:p>
-          <w:p>
-            <w:pPr>
-              <w:spacing w:after="120" w:before="0" w:line="276"/>
-              <w:jc w:val="center"/>
-            </w:pPr>
-            <w:r>
-              <w:rPr>
-                <w:rFonts w:ascii="Times New Roman" w:cs="Times New Roman" w:eastAsia="Times New Roman" w:hAnsi="Times New Roman"/>
-                <w:b/>
-                <w:bCs/>
-              </w:rPr>
-              <w:t xml:space="preserve"/>
-            </w:r>
-          </w:p>
-        </w:tc>
-        <w:tc>
-          <w:tcPr>
-            <w:tcW w:type="dxa" w:w="3024"/>
-            <w:tcMar>
-              <w:top w:type="dxa" w:w="40"/>
-              <w:left w:type="dxa" w:w="80"/>
-              <w:bottom w:type="dxa" w:w="40"/>
-              <w:right w:type="dxa" w:w="80"/>
-            </w:tcMar>
-            <w:vAlign w:val="top"/>
-          </w:tcPr>
-          <w:p>
-            <w:pPr>
-              <w:spacing w:after="0" w:before="120" w:line="276"/>
-              <w:jc w:val="center"/>
-            </w:pPr>
-            <w:r>
-              <w:rPr>
-                <w:rFonts w:ascii="Times New Roman" w:cs="Times New Roman" w:eastAsia="Times New Roman" w:hAnsi="Times New Roman"/>
-                <w:b/>
-                <w:bCs/>
-              </w:rPr>
-              <w:t xml:space="preserve">CHỈ HUY TRƯỞNG</w:t>
-            </w:r>
-          </w:p>
-          <w:p>
-            <w:pPr>
-              <w:spacing w:after="0" w:before="0" w:line="276"/>
-              <w:jc w:val="center"/>
-            </w:pPr>
-            <w:r>
-              <w:rPr>
-                <w:rFonts w:ascii="Times New Roman" w:cs="Times New Roman" w:eastAsia="Times New Roman" w:hAnsi="Times New Roman"/>
-                <w:i/>
-                <w:iCs/>
-              </w:rPr>
-              <w:t xml:space="preserve">(Ký, ghi rõ họ tên, chức vụ)</w:t>
-            </w:r>
-          </w:p>
-          <w:p>
-            <w:pPr>
-              <w:spacing w:after="40" w:before="40" w:line="276"/>
-              <w:jc w:val="both"/>
-            </w:pPr>
-            <w:r>
-              <w:rPr>
-                <w:rFonts w:ascii="Times New Roman" w:cs="Times New Roman" w:eastAsia="Times New Roman" w:hAnsi="Times New Roman"/>
-              </w:rPr>
-              <w:t xml:space="preserve"/>
-            </w:r>
-          </w:p>
-          <w:p>
-            <w:pPr>
-              <w:spacing w:after="40" w:before="40" w:line="276"/>
-              <w:jc w:val="both"/>
-            </w:pPr>
-            <w:r>
-              <w:rPr>
-                <w:rFonts w:ascii="Times New Roman" w:cs="Times New Roman" w:eastAsia="Times New Roman" w:hAnsi="Times New Roman"/>
-              </w:rPr>
-              <w:t xml:space="preserve"/>
-            </w:r>
-          </w:p>
-          <w:p>
-            <w:pPr>
-              <w:spacing w:after="40" w:before="40" w:line="276"/>
-              <w:jc w:val="both"/>
-            </w:pPr>
-            <w:r>
-              <w:rPr>
-                <w:rFonts w:ascii="Times New Roman" w:cs="Times New Roman" w:eastAsia="Times New Roman" w:hAnsi="Times New Roman"/>
-              </w:rPr>
-              <w:t xml:space="preserve"/>
-            </w:r>
-          </w:p>
-          <w:p>
-            <w:pPr>
-              <w:spacing w:after="40" w:before="40" w:line="276"/>
-              <w:jc w:val="both"/>
-            </w:pPr>
-            <w:r>
-              <w:rPr>
-                <w:rFonts w:ascii="Times New Roman" w:cs="Times New Roman" w:eastAsia="Times New Roman" w:hAnsi="Times New Roman"/>
-              </w:rPr>
-              <w:t xml:space="preserve"/>
-            </w:r>
-          </w:p>
-          <w:p>
-            <w:pPr>
-              <w:spacing w:after="120" w:before="0" w:line="276"/>
-              <w:jc w:val="center"/>
-            </w:pPr>
-            <w:r>
-              <w:rPr>
-                <w:rFonts w:ascii="Times New Roman" w:cs="Times New Roman" w:eastAsia="Times New Roman" w:hAnsi="Times New Roman"/>
-                <w:b/>
-                <w:bCs/>
-              </w:rPr>
-              <w:t xml:space="preserve">Đinh Trọng Bình</w:t>
-            </w:r>
-          </w:p>
-        </w:tc>
-      </w:tr>
-    </w:tbl>
-    <w:p>
-      <w:r>
-        <w:br w:type="page"/>
-      </w:r>
-    </w:p>
-    <w:p>
-      <w:pPr>
-        <w:spacing w:after="60" w:before="0" w:line="276"/>
-        <w:jc w:val="right"/>
-      </w:pPr>
-      <w:r>
-        <w:rPr>
-          <w:rFonts w:ascii="Times New Roman" w:cs="Times New Roman" w:eastAsia="Times New Roman" w:hAnsi="Times New Roman"/>
-          <w:i/>
-          <w:iCs/>
-        </w:rPr>
-        <w:t xml:space="preserve">BM-07 – Nghiệm thu công việc xây dựng</w:t>
-      </w:r>
-    </w:p>
-    <w:p>
-      <w:pPr>
-        <w:spacing w:after="0" w:before="0" w:line="276"/>
-        <w:jc w:val="center"/>
-      </w:pPr>
-      <w:r>
-        <w:rPr>
-          <w:rFonts w:ascii="Times New Roman" w:cs="Times New Roman" w:eastAsia="Times New Roman" w:hAnsi="Times New Roman"/>
-          <w:b/>
-          <w:bCs/>
-        </w:rPr>
-        <w:t xml:space="preserve">CỘNG HÒA XÃ HỘI CHỦ NGHĨA VIỆT NAM</w:t>
-      </w:r>
-    </w:p>
-    <w:p>
-      <w:pPr>
-        <w:spacing w:after="120" w:before="0" w:line="276"/>
-        <w:jc w:val="center"/>
-      </w:pPr>
-      <w:r>
-        <w:rPr>
-          <w:rFonts w:ascii="Times New Roman" w:cs="Times New Roman" w:eastAsia="Times New Roman" w:hAnsi="Times New Roman"/>
-          <w:b/>
-          <w:bCs/>
-          <w:u w:val="single"/>
-        </w:rPr>
-        <w:t xml:space="preserve">Độc lập - Tự do - Hạnh phúc</w:t>
-      </w:r>
-    </w:p>
-    <w:p>
-      <w:pPr>
-        <w:spacing w:after="120" w:before="0" w:line="276"/>
-        <w:jc w:val="right"/>
-      </w:pPr>
-      <w:r>
-        <w:rPr>
-          <w:rFonts w:ascii="Times New Roman" w:cs="Times New Roman" w:eastAsia="Times New Roman" w:hAnsi="Times New Roman"/>
-          <w:i/>
-          <w:iCs/>
-        </w:rPr>
-        <w:t xml:space="preserve">Hoằng Tiến, ngày ..... tháng ..... năm 2026</w:t>
-      </w:r>
-    </w:p>
-    <w:p>
-      <w:pPr>
-        <w:spacing w:after="0" w:before="120" w:line="276"/>
-        <w:jc w:val="center"/>
-      </w:pPr>
-      <w:r>
-        <w:rPr>
-          <w:rFonts w:ascii="Times New Roman" w:cs="Times New Roman" w:eastAsia="Times New Roman" w:hAnsi="Times New Roman"/>
-          <w:b/>
-          <w:bCs/>
-        </w:rPr>
-        <w:t xml:space="preserve">Số: ......../BBNT-CV</w:t>
-      </w:r>
-    </w:p>
-    <w:p>
-      <w:pPr>
-        <w:spacing w:after="0" w:before="0" w:line="276"/>
-        <w:jc w:val="center"/>
-      </w:pPr>
-      <w:r>
-        <w:rPr>
-          <w:rFonts w:ascii="Times New Roman" w:cs="Times New Roman" w:eastAsia="Times New Roman" w:hAnsi="Times New Roman"/>
-          <w:b/>
-          <w:bCs/>
-        </w:rPr>
-        <w:t xml:space="preserve">BIÊN BẢN NGHIỆM THU CÔNG VIỆC XÂY DỰNG</w:t>
-      </w:r>
-    </w:p>
-    <w:p>
-      <w:pPr>
-        <w:spacing w:after="60" w:before="40" w:line="276"/>
-        <w:jc w:val="both"/>
-      </w:pPr>
-      <w:r>
-        <w:rPr>
-          <w:rFonts w:ascii="Times New Roman" w:cs="Times New Roman" w:eastAsia="Times New Roman" w:hAnsi="Times New Roman"/>
-        </w:rPr>
-        <w:t xml:space="preserve"/>
-      </w:r>
-    </w:p>
-    <w:p>
-      <w:pPr>
-        <w:spacing w:after="40" w:before="40" w:line="276"/>
-        <w:jc w:val="both"/>
-      </w:pPr>
-      <w:r>
-        <w:rPr>
-          <w:rFonts w:ascii="Times New Roman" w:cs="Times New Roman" w:eastAsia="Times New Roman" w:hAnsi="Times New Roman"/>
-          <w:b/>
-          <w:bCs/>
-        </w:rPr>
-        <w:t xml:space="preserve">Dự án: </w:t>
-      </w:r>
-      <w:r>
-        <w:rPr>
-          <w:rFonts w:ascii="Times New Roman" w:cs="Times New Roman" w:eastAsia="Times New Roman" w:hAnsi="Times New Roman"/>
-        </w:rPr>
-        <w:t xml:space="preserve">Xử lý khẩn cấp kè biển khu du lịch Hải Tiến, xã Hoằng Tiến.</w:t>
-      </w:r>
-    </w:p>
-    <w:p>
-      <w:pPr>
-        <w:spacing w:after="40" w:before="40" w:line="276"/>
-        <w:jc w:val="both"/>
-      </w:pPr>
-      <w:r>
-        <w:rPr>
-          <w:rFonts w:ascii="Times New Roman" w:cs="Times New Roman" w:eastAsia="Times New Roman" w:hAnsi="Times New Roman"/>
-          <w:b/>
-          <w:bCs/>
-        </w:rPr>
-        <w:t xml:space="preserve">Gói thầu: </w:t>
-      </w:r>
-      <w:r>
-        <w:rPr>
-          <w:rFonts w:ascii="Times New Roman" w:cs="Times New Roman" w:eastAsia="Times New Roman" w:hAnsi="Times New Roman"/>
-        </w:rPr>
-        <w:t xml:space="preserve">số 06 – Thi công xây dựng (bao gồm bảo hiểm công trình, đảm bảo an toàn giao thông).</w:t>
-      </w:r>
-    </w:p>
-    <w:p>
-      <w:pPr>
-        <w:spacing w:after="40" w:before="40" w:line="276"/>
-        <w:jc w:val="both"/>
-      </w:pPr>
-      <w:r>
-        <w:rPr>
-          <w:rFonts w:ascii="Times New Roman" w:cs="Times New Roman" w:eastAsia="Times New Roman" w:hAnsi="Times New Roman"/>
-          <w:b/>
-          <w:bCs/>
-        </w:rPr>
-        <w:t xml:space="preserve">Hạng mục: </w:t>
-      </w:r>
-      <w:r>
-        <w:rPr>
-          <w:rFonts w:ascii="Times New Roman" w:cs="Times New Roman" w:eastAsia="Times New Roman" w:hAnsi="Times New Roman"/>
-          <w:i/>
-          <w:iCs/>
-        </w:rPr>
-        <w:t xml:space="preserve">(ví dụ: Cống hộp đúc sẵn BxH = 2x(1,5x1,5)m ngang kênh tại Km3+500)</w:t>
-      </w:r>
-    </w:p>
-    <w:p>
-      <w:pPr>
-        <w:spacing w:after="40" w:before="40" w:line="276"/>
-        <w:jc w:val="both"/>
-      </w:pPr>
-      <w:r>
-        <w:rPr>
-          <w:rFonts w:ascii="Times New Roman" w:cs="Times New Roman" w:eastAsia="Times New Roman" w:hAnsi="Times New Roman"/>
-          <w:b/>
-          <w:bCs/>
-        </w:rPr>
-        <w:t xml:space="preserve">Địa điểm xây dựng: </w:t>
-      </w:r>
-      <w:r>
-        <w:rPr>
-          <w:rFonts w:ascii="Times New Roman" w:cs="Times New Roman" w:eastAsia="Times New Roman" w:hAnsi="Times New Roman"/>
-        </w:rPr>
-        <w:t xml:space="preserve">Xã Hoằng Tiến, tỉnh Thanh Hóa.</w:t>
-      </w:r>
-    </w:p>
-    <w:p>
-      <w:pPr>
-        <w:keepNext/>
-        <w:spacing w:after="40" w:before="100" w:line="276"/>
-        <w:jc w:val="both"/>
-      </w:pPr>
-      <w:r>
-        <w:rPr>
-          <w:rFonts w:ascii="Times New Roman" w:cs="Times New Roman" w:eastAsia="Times New Roman" w:hAnsi="Times New Roman"/>
-          <w:b/>
-          <w:bCs/>
-        </w:rPr>
-        <w:t xml:space="preserve">1. Tên công việc được nghiệm thu: </w:t>
-      </w:r>
-    </w:p>
-    <w:p>
-      <w:pPr>
-        <w:spacing w:after="40" w:before="40" w:line="276"/>
-        <w:jc w:val="both"/>
-      </w:pPr>
-      <w:r>
-        <w:rPr>
-          <w:rFonts w:ascii="Times New Roman" w:cs="Times New Roman" w:eastAsia="Times New Roman" w:hAnsi="Times New Roman"/>
-          <w:i/>
-          <w:iCs/>
-        </w:rPr>
-        <w:t xml:space="preserve">(ghi rõ tên công việc, vị trí, lý trình; có thể lập chung cho nhiều công việc của một hạng mục theo trình tự thi công)</w:t>
-      </w:r>
-    </w:p>
-    <w:p>
-      <w:pPr>
-        <w:tabs>
-          <w:tab w:val="right" w:pos="9072" w:leader="dot"/>
-        </w:tabs>
-        <w:spacing w:after="40" w:before="40" w:line="276"/>
-      </w:pPr>
-      <w:r>
-        <w:rPr>
-          <w:rFonts w:ascii="Times New Roman" w:cs="Times New Roman" w:eastAsia="Times New Roman" w:hAnsi="Times New Roman"/>
-        </w:rPr>
-        <w:t xml:space="preserve"/>
-      </w:r>
-      <w:r>
-        <w:rPr>
-          <w:rFonts w:ascii="Times New Roman" w:cs="Times New Roman" w:eastAsia="Times New Roman" w:hAnsi="Times New Roman"/>
-        </w:rPr>
-        <w:t xml:space="preserve">	</w:t>
-      </w:r>
-    </w:p>
-    <w:p>
-      <w:pPr>
-        <w:keepNext/>
-        <w:spacing w:after="40" w:before="100" w:line="276"/>
-        <w:jc w:val="both"/>
-      </w:pPr>
-      <w:r>
-        <w:rPr>
-          <w:rFonts w:ascii="Times New Roman" w:cs="Times New Roman" w:eastAsia="Times New Roman" w:hAnsi="Times New Roman"/>
-          <w:b/>
-          <w:bCs/>
-        </w:rPr>
-        <w:t xml:space="preserve">2. Thành phần ký biên bản nghiệm thu:</w:t>
-      </w:r>
-    </w:p>
-    <w:p>
-      <w:pPr>
-        <w:keepNext/>
-        <w:spacing w:after="40" w:before="40" w:line="276"/>
-        <w:jc w:val="both"/>
-      </w:pPr>
-      <w:r>
-        <w:rPr>
-          <w:rFonts w:ascii="Times New Roman" w:cs="Times New Roman" w:eastAsia="Times New Roman" w:hAnsi="Times New Roman"/>
-          <w:b/>
-          <w:bCs/>
-        </w:rPr>
-        <w:t xml:space="preserve">2.1. Người trực tiếp giám sát thi công xây dựng của chủ đầu tư – </w:t>
-      </w:r>
-      <w:r>
-        <w:rPr>
-          <w:rFonts w:ascii="Times New Roman" w:cs="Times New Roman" w:eastAsia="Times New Roman" w:hAnsi="Times New Roman"/>
-          <w:b/>
-          <w:bCs/>
-        </w:rPr>
-        <w:t xml:space="preserve">Công ty Cổ phần Tư vấn xây dựng Vinasean</w:t>
-      </w:r>
-    </w:p>
-    <w:p>
-      <w:pPr>
-        <w:tabs>
-          <w:tab w:val="left" w:pos="4700" w:leader="none"/>
-          <w:tab w:val="right" w:pos="8788" w:leader="dot"/>
-        </w:tabs>
-        <w:spacing w:after="30" w:before="30" w:line="276"/>
-        <w:ind w:left="284"/>
-      </w:pPr>
-      <w:r>
-        <w:rPr>
-          <w:rFonts w:ascii="Times New Roman" w:cs="Times New Roman" w:eastAsia="Times New Roman" w:hAnsi="Times New Roman"/>
-        </w:rPr>
-        <w:t xml:space="preserve">- Ông (Bà): Lê Ngọc Đông</w:t>
-      </w:r>
-      <w:r>
-        <w:rPr>
-          <w:rFonts w:ascii="Times New Roman" w:cs="Times New Roman" w:eastAsia="Times New Roman" w:hAnsi="Times New Roman"/>
-        </w:rPr>
-        <w:t xml:space="preserve">	Chức vụ: Tư vấn giám sát viên</w:t>
-      </w:r>
-    </w:p>
-    <w:p>
-      <w:pPr>
-        <w:tabs>
-          <w:tab w:val="left" w:pos="4700" w:leader="none"/>
-          <w:tab w:val="right" w:pos="8788" w:leader="dot"/>
-        </w:tabs>
-        <w:spacing w:after="30" w:before="30" w:line="276"/>
-        <w:ind w:left="284"/>
-      </w:pPr>
-      <w:r>
-        <w:rPr>
-          <w:rFonts w:ascii="Times New Roman" w:cs="Times New Roman" w:eastAsia="Times New Roman" w:hAnsi="Times New Roman"/>
-        </w:rPr>
-        <w:t xml:space="preserve">- Ông (Bà): Lê Đại Dương</w:t>
-      </w:r>
-      <w:r>
-        <w:rPr>
-          <w:rFonts w:ascii="Times New Roman" w:cs="Times New Roman" w:eastAsia="Times New Roman" w:hAnsi="Times New Roman"/>
-        </w:rPr>
-        <w:t xml:space="preserve">	Chức vụ: Tư vấn giám sát viên</w:t>
-      </w:r>
-    </w:p>
-    <w:p>
-      <w:pPr>
-        <w:keepNext/>
-        <w:spacing w:after="40" w:before="40" w:line="276"/>
-        <w:jc w:val="both"/>
-      </w:pPr>
-      <w:r>
-        <w:rPr>
-          <w:rFonts w:ascii="Times New Roman" w:cs="Times New Roman" w:eastAsia="Times New Roman" w:hAnsi="Times New Roman"/>
-          <w:b/>
-          <w:bCs/>
-        </w:rPr>
-        <w:t xml:space="preserve">2.2. Người trực tiếp phụ trách kỹ thuật thi công của nhà thầu – </w:t>
-      </w:r>
-      <w:r>
-        <w:rPr>
-          <w:rFonts w:ascii="Times New Roman" w:cs="Times New Roman" w:eastAsia="Times New Roman" w:hAnsi="Times New Roman"/>
-          <w:b/>
-          <w:bCs/>
-        </w:rPr>
-        <w:t xml:space="preserve">Liên danh Công ty TNHH Hoàng Tuấn – Công ty Cổ phần Đầu tư và Xây dựng Tuấn Linh</w:t>
-      </w:r>
-    </w:p>
-    <w:p>
-      <w:pPr>
-        <w:keepNext/>
-        <w:spacing w:after="40" w:before="40" w:line="276"/>
-        <w:jc w:val="both"/>
-      </w:pPr>
-      <w:r>
-        <w:rPr>
-          <w:rFonts w:ascii="Times New Roman" w:cs="Times New Roman" w:eastAsia="Times New Roman" w:hAnsi="Times New Roman"/>
-          <w:i/>
-          <w:iCs/>
-        </w:rPr>
-        <w:t xml:space="preserve">- Công ty TNHH Hoàng Tuấn:</w:t>
-      </w:r>
-    </w:p>
-    <w:p>
-      <w:pPr>
-        <w:tabs>
-          <w:tab w:val="left" w:pos="4700" w:leader="none"/>
-          <w:tab w:val="right" w:pos="8788" w:leader="dot"/>
-        </w:tabs>
-        <w:spacing w:after="30" w:before="30" w:line="276"/>
-        <w:ind w:left="284"/>
-      </w:pPr>
-      <w:r>
-        <w:rPr>
-          <w:rFonts w:ascii="Times New Roman" w:cs="Times New Roman" w:eastAsia="Times New Roman" w:hAnsi="Times New Roman"/>
-        </w:rPr>
-        <w:t xml:space="preserve">- Ông (Bà): Lê Công Trung</w:t>
-      </w:r>
-      <w:r>
-        <w:rPr>
-          <w:rFonts w:ascii="Times New Roman" w:cs="Times New Roman" w:eastAsia="Times New Roman" w:hAnsi="Times New Roman"/>
-        </w:rPr>
-        <w:t xml:space="preserve">	Chức vụ: Cán bộ kỹ thuật thi công trực tiếp</w:t>
-      </w:r>
-    </w:p>
-    <w:p>
-      <w:pPr>
-        <w:keepNext/>
-        <w:spacing w:after="40" w:before="40" w:line="276"/>
-        <w:jc w:val="both"/>
-      </w:pPr>
-      <w:r>
-        <w:rPr>
-          <w:rFonts w:ascii="Times New Roman" w:cs="Times New Roman" w:eastAsia="Times New Roman" w:hAnsi="Times New Roman"/>
-          <w:i/>
-          <w:iCs/>
-        </w:rPr>
-        <w:t xml:space="preserve">- Công ty Cổ phần Đầu tư và Xây dựng Tuấn Linh:</w:t>
-      </w:r>
-    </w:p>
-    <w:p>
-      <w:pPr>
-        <w:tabs>
-          <w:tab w:val="left" w:pos="4700" w:leader="dot"/>
-          <w:tab w:val="right" w:pos="8788" w:leader="dot"/>
-        </w:tabs>
-        <w:spacing w:after="30" w:before="30" w:line="276"/>
-        <w:ind w:left="284"/>
-      </w:pPr>
-      <w:r>
-        <w:rPr>
-          <w:rFonts w:ascii="Times New Roman" w:cs="Times New Roman" w:eastAsia="Times New Roman" w:hAnsi="Times New Roman"/>
-        </w:rPr>
-        <w:t xml:space="preserve">- Ông (Bà): </w:t>
-      </w:r>
-      <w:r>
-        <w:rPr>
-          <w:rFonts w:ascii="Times New Roman" w:cs="Times New Roman" w:eastAsia="Times New Roman" w:hAnsi="Times New Roman"/>
-        </w:rPr>
         <w:t xml:space="preserve">	Chức vụ: Cán bộ kỹ thuật thi công trực tiếp</w:t>
       </w:r>
     </w:p>
@@ -16192,18 +14415,6 @@
           <w:rFonts w:ascii="Times New Roman" w:cs="Times New Roman" w:eastAsia="Times New Roman" w:hAnsi="Times New Roman"/>
         </w:rPr>
         <w:t xml:space="preserve">- Phiếu yêu cầu nghiệm thu số ......../PYCNT-HT-TL ngày ...../...../2026 của Nhà thầu;</w:t>
-      </w:r>
-    </w:p>
-    <w:p>
-      <w:pPr>
-        <w:spacing w:after="40" w:before="40" w:line="276"/>
-        <w:jc w:val="both"/>
-      </w:pPr>
-      <w:r>
-        <w:rPr>
-          <w:rFonts w:ascii="Times New Roman" w:cs="Times New Roman" w:eastAsia="Times New Roman" w:hAnsi="Times New Roman"/>
-        </w:rPr>
-        <w:t xml:space="preserve">- Biên bản kiểm tra nội bộ của Nhà thầu số ......../BBNB-HT-TL ngày ...../...../2026;</w:t>
       </w:r>
     </w:p>
     <w:p>
@@ -17619,7 +15830,7 @@
           <w:i/>
           <w:iCs/>
         </w:rPr>
-        <w:t xml:space="preserve">BM-08 – Nghiệm thu giai đoạn / bộ phận công trình</w:t>
+        <w:t xml:space="preserve">BM-07 – Nghiệm thu giai đoạn / bộ phận công trình</w:t>
       </w:r>
     </w:p>
     <w:p>
@@ -18929,7 +17140,7 @@
           <w:i/>
           <w:iCs/>
         </w:rPr>
-        <w:t xml:space="preserve">BM-09 – Nghiệm thu hoàn thành hạng mục / công trình</w:t>
+        <w:t xml:space="preserve">BM-08 – Nghiệm thu hoàn thành hạng mục / công trình</w:t>
       </w:r>
     </w:p>
     <w:p>
@@ -20650,7 +18861,7 @@
         <w:rPr>
           <w:rFonts w:ascii="Times New Roman" w:cs="Times New Roman" w:eastAsia="Times New Roman" w:hAnsi="Times New Roman"/>
         </w:rPr>
-        <w:t xml:space="preserve">- Hồ sơ hoàn thành công trình theo danh mục BM-16;</w:t>
+        <w:t xml:space="preserve">- Hồ sơ hoàn thành công trình theo danh mục BM-15;</w:t>
       </w:r>
     </w:p>
     <w:p>
@@ -20695,7 +18906,7 @@
           <w:i/>
           <w:iCs/>
         </w:rPr>
-        <w:t xml:space="preserve">BM-10 – Bàn giao công trình đưa vào sử dụng</w:t>
+        <w:t xml:space="preserve">BM-09 – Bàn giao công trình đưa vào sử dụng</w:t>
       </w:r>
     </w:p>
     <w:p>
@@ -22136,7 +20347,7 @@
           <w:i/>
           <w:iCs/>
         </w:rPr>
-        <w:t xml:space="preserve">BM-11 – Xác nhận khối lượng hoàn thành</w:t>
+        <w:t xml:space="preserve">BM-10 – Xác nhận khối lượng hoàn thành</w:t>
       </w:r>
     </w:p>
     <w:p>
@@ -23670,7 +21881,7 @@
           <w:i/>
           <w:iCs/>
         </w:rPr>
-        <w:t xml:space="preserve">BM-12 – Kiểm tra, xử lý vi phạm chất lượng</w:t>
+        <w:t xml:space="preserve">BM-11 – Kiểm tra, xử lý vi phạm chất lượng</w:t>
       </w:r>
     </w:p>
     <w:p>
@@ -24704,7 +22915,7 @@
           <w:i/>
           <w:iCs/>
         </w:rPr>
-        <w:t xml:space="preserve">BM-13 – Xử lý kỹ thuật hiện trường</w:t>
+        <w:t xml:space="preserve">BM-12 – Xử lý kỹ thuật hiện trường</w:t>
       </w:r>
     </w:p>
     <w:p>
@@ -26284,7 +24495,7 @@
           <w:i/>
           <w:iCs/>
         </w:rPr>
-        <w:t xml:space="preserve">BM-14 – Nhật ký thi công xây dựng công trình</w:t>
+        <w:t xml:space="preserve">BM-13 – Nhật ký thi công xây dựng công trình</w:t>
       </w:r>
     </w:p>
     <w:p>
@@ -28896,7 +27107,7 @@
           <w:i/>
           <w:iCs/>
         </w:rPr>
-        <w:t xml:space="preserve">BM-15 – Bản vẽ hoàn công – mẫu dấu</w:t>
+        <w:t xml:space="preserve">BM-14 – Bản vẽ hoàn công – mẫu dấu</w:t>
       </w:r>
     </w:p>
     <w:p>
@@ -29808,7 +28019,7 @@
           <w:i/>
           <w:iCs/>
         </w:rPr>
-        <w:t xml:space="preserve">BM-16 – Danh mục hồ sơ hoàn thành công trình</w:t>
+        <w:t xml:space="preserve">BM-15 – Danh mục hồ sơ hoàn thành công trình</w:t>
       </w:r>
     </w:p>
     <w:p>
@@ -31413,7 +29624,7 @@
               <w:rPr>
                 <w:rFonts w:ascii="Times New Roman" w:cs="Times New Roman" w:eastAsia="Times New Roman" w:hAnsi="Times New Roman"/>
               </w:rPr>
-              <w:t xml:space="preserve">Bản vẽ hoàn công (có danh mục bản vẽ kèm theo) – BM-15.</w:t>
+              <w:t xml:space="preserve">Bản vẽ hoàn công (có danh mục bản vẽ kèm theo) – BM-14.</w:t>
             </w:r>
           </w:p>
         </w:tc>
@@ -31903,7 +30114,7 @@
               <w:rPr>
                 <w:rFonts w:ascii="Times New Roman" w:cs="Times New Roman" w:eastAsia="Times New Roman" w:hAnsi="Times New Roman"/>
               </w:rPr>
-              <w:t xml:space="preserve">Nhật ký thi công xây dựng công trình (BM-14).</w:t>
+              <w:t xml:space="preserve">Nhật ký thi công xây dựng công trình (BM-13).</w:t>
             </w:r>
           </w:p>
         </w:tc>
@@ -32001,7 +30212,7 @@
               <w:rPr>
                 <w:rFonts w:ascii="Times New Roman" w:cs="Times New Roman" w:eastAsia="Times New Roman" w:hAnsi="Times New Roman"/>
               </w:rPr>
-              <w:t xml:space="preserve">Các biên bản nghiệm thu công việc xây dựng (BM-07), nghiệm thu giai đoạn / bộ phận công trình (BM-08).</w:t>
+              <w:t xml:space="preserve">Các biên bản nghiệm thu công việc xây dựng (BM-06), nghiệm thu giai đoạn / bộ phận công trình (BM-07).</w:t>
             </w:r>
           </w:p>
         </w:tc>
@@ -32197,7 +30408,7 @@
               <w:rPr>
                 <w:rFonts w:ascii="Times New Roman" w:cs="Times New Roman" w:eastAsia="Times New Roman" w:hAnsi="Times New Roman"/>
               </w:rPr>
-              <w:t xml:space="preserve">Biên bản xử lý kỹ thuật (BM-13), xử lý vi phạm chất lượng (BM-12) và hồ sơ giải quyết sự cố công trình (nếu có).</w:t>
+              <w:t xml:space="preserve">Biên bản xử lý kỹ thuật (BM-12), xử lý vi phạm chất lượng (BM-11) và hồ sơ giải quyết sự cố công trình (nếu có).</w:t>
             </w:r>
           </w:p>
         </w:tc>
@@ -32589,7 +30800,7 @@
               <w:rPr>
                 <w:rFonts w:ascii="Times New Roman" w:cs="Times New Roman" w:eastAsia="Times New Roman" w:hAnsi="Times New Roman"/>
               </w:rPr>
-              <w:t xml:space="preserve">Biên bản nghiệm thu hoàn thành hạng mục công trình / công trình (BM-09) và phụ lục tồn tại cần khắc phục (nếu có).</w:t>
+              <w:t xml:space="preserve">Biên bản nghiệm thu hoàn thành hạng mục công trình / công trình (BM-08) và phụ lục tồn tại cần khắc phục (nếu có).</w:t>
             </w:r>
           </w:p>
         </w:tc>
@@ -32687,7 +30898,7 @@
               <w:rPr>
                 <w:rFonts w:ascii="Times New Roman" w:cs="Times New Roman" w:eastAsia="Times New Roman" w:hAnsi="Times New Roman"/>
               </w:rPr>
-              <w:t xml:space="preserve">Biên bản bàn giao công trình đưa vào sử dụng (BM-10).</w:t>
+              <w:t xml:space="preserve">Biên bản bàn giao công trình đưa vào sử dụng (BM-09).</w:t>
             </w:r>
           </w:p>
         </w:tc>

</xml_diff>